<commit_message>
feat: write uvod and almost all of the mobile movement validation part
</commit_message>
<xml_diff>
--- a/docs/thesis/navodila_za_pisanje_zakljucnih_del_1_in_2_stopnje_2025.docx
+++ b/docs/thesis/navodila_za_pisanje_zakljucnih_del_1_in_2_stopnje_2025.docx
@@ -1609,6 +1609,7 @@
           <w:szCs w:val="36"/>
           <w:lang w:val="sl-SI"/>
         </w:rPr>
+        <w:lastRenderedPageBreak/>
         <w:t>UVOD</w:t>
       </w:r>
       <w:bookmarkEnd w:id="0"/>
@@ -1880,6 +1881,7 @@
           <w:szCs w:val="24"/>
         </w:rPr>
       </w:pPr>
+      <w:proofErr w:type="spellStart"/>
       <w:r>
         <w:rPr>
           <w:rFonts w:ascii="Calibri" w:hAnsi="Calibri"/>
@@ -1896,8 +1898,69 @@
           <w:szCs w:val="24"/>
           <w:lang w:val="en-US"/>
         </w:rPr>
-        <w:t>aslednja notranja naslovna stran</w:t>
-      </w:r>
+        <w:t>aslednja</w:t>
+      </w:r>
+      <w:proofErr w:type="spellEnd"/>
+      <w:r>
+        <w:rPr>
+          <w:rFonts w:ascii="Calibri" w:hAnsi="Calibri"/>
+          <w:sz w:val="24"/>
+          <w:szCs w:val="24"/>
+          <w:lang w:val="en-US"/>
+        </w:rPr>
+        <w:t xml:space="preserve"> </w:t>
+      </w:r>
+      <w:proofErr w:type="spellStart"/>
+      <w:r>
+        <w:rPr>
+          <w:rFonts w:ascii="Calibri" w:hAnsi="Calibri"/>
+          <w:sz w:val="24"/>
+          <w:szCs w:val="24"/>
+          <w:lang w:val="en-US"/>
+        </w:rPr>
+        <w:t>notranja</w:t>
+      </w:r>
+      <w:proofErr w:type="spellEnd"/>
+      <w:r>
+        <w:rPr>
+          <w:rFonts w:ascii="Calibri" w:hAnsi="Calibri"/>
+          <w:sz w:val="24"/>
+          <w:szCs w:val="24"/>
+          <w:lang w:val="en-US"/>
+        </w:rPr>
+        <w:t xml:space="preserve"> </w:t>
+      </w:r>
+      <w:proofErr w:type="spellStart"/>
+      <w:r>
+        <w:rPr>
+          <w:rFonts w:ascii="Calibri" w:hAnsi="Calibri"/>
+          <w:sz w:val="24"/>
+          <w:szCs w:val="24"/>
+          <w:lang w:val="en-US"/>
+        </w:rPr>
+        <w:t>naslovna</w:t>
+      </w:r>
+      <w:proofErr w:type="spellEnd"/>
+      <w:r>
+        <w:rPr>
+          <w:rFonts w:ascii="Calibri" w:hAnsi="Calibri"/>
+          <w:sz w:val="24"/>
+          <w:szCs w:val="24"/>
+          <w:lang w:val="en-US"/>
+        </w:rPr>
+        <w:t xml:space="preserve"> </w:t>
+      </w:r>
+      <w:proofErr w:type="spellStart"/>
+      <w:r>
+        <w:rPr>
+          <w:rFonts w:ascii="Calibri" w:hAnsi="Calibri"/>
+          <w:sz w:val="24"/>
+          <w:szCs w:val="24"/>
+          <w:lang w:val="en-US"/>
+        </w:rPr>
+        <w:t>stran</w:t>
+      </w:r>
+      <w:proofErr w:type="spellEnd"/>
     </w:p>
     <w:p>
       <w:pPr>
@@ -1912,6 +1975,7 @@
           <w:szCs w:val="24"/>
         </w:rPr>
       </w:pPr>
+      <w:proofErr w:type="spellStart"/>
       <w:r>
         <w:rPr>
           <w:rFonts w:ascii="Calibri" w:hAnsi="Calibri"/>
@@ -1930,6 +1994,7 @@
         </w:rPr>
         <w:t>ahvala</w:t>
       </w:r>
+      <w:proofErr w:type="spellEnd"/>
     </w:p>
     <w:p>
       <w:pPr>
@@ -2118,6 +2183,7 @@
           <w:szCs w:val="24"/>
         </w:rPr>
       </w:pPr>
+      <w:proofErr w:type="spellStart"/>
       <w:r>
         <w:rPr>
           <w:rFonts w:ascii="Calibri" w:hAnsi="Calibri"/>
@@ -2134,8 +2200,29 @@
           <w:szCs w:val="24"/>
           <w:lang w:val="en-US"/>
         </w:rPr>
-        <w:t>azalo grafov</w:t>
-      </w:r>
+        <w:t>azalo</w:t>
+      </w:r>
+      <w:proofErr w:type="spellEnd"/>
+      <w:r>
+        <w:rPr>
+          <w:rFonts w:ascii="Calibri" w:hAnsi="Calibri"/>
+          <w:sz w:val="24"/>
+          <w:szCs w:val="24"/>
+          <w:lang w:val="en-US"/>
+        </w:rPr>
+        <w:t xml:space="preserve"> </w:t>
+      </w:r>
+      <w:proofErr w:type="spellStart"/>
+      <w:r>
+        <w:rPr>
+          <w:rFonts w:ascii="Calibri" w:hAnsi="Calibri"/>
+          <w:sz w:val="24"/>
+          <w:szCs w:val="24"/>
+          <w:lang w:val="en-US"/>
+        </w:rPr>
+        <w:t>grafov</w:t>
+      </w:r>
+      <w:proofErr w:type="spellEnd"/>
     </w:p>
     <w:p>
       <w:pPr>
@@ -2289,6 +2376,7 @@
           <w:szCs w:val="24"/>
         </w:rPr>
       </w:pPr>
+      <w:proofErr w:type="spellStart"/>
       <w:r>
         <w:rPr>
           <w:rFonts w:ascii="Calibri" w:hAnsi="Calibri"/>
@@ -2305,8 +2393,9 @@
           <w:szCs w:val="24"/>
           <w:lang w:val="en-US"/>
         </w:rPr>
-        <w:t>riloge k zaključnem</w:t>
-      </w:r>
+        <w:t>riloge</w:t>
+      </w:r>
+      <w:proofErr w:type="spellEnd"/>
       <w:r>
         <w:rPr>
           <w:rFonts w:ascii="Calibri" w:hAnsi="Calibri"/>
@@ -2314,8 +2403,28 @@
           <w:szCs w:val="24"/>
           <w:lang w:val="en-US"/>
         </w:rPr>
+        <w:t xml:space="preserve"> k </w:t>
+      </w:r>
+      <w:proofErr w:type="spellStart"/>
+      <w:r>
+        <w:rPr>
+          <w:rFonts w:ascii="Calibri" w:hAnsi="Calibri"/>
+          <w:sz w:val="24"/>
+          <w:szCs w:val="24"/>
+          <w:lang w:val="en-US"/>
+        </w:rPr>
+        <w:t>zaključnem</w:t>
+      </w:r>
+      <w:r>
+        <w:rPr>
+          <w:rFonts w:ascii="Calibri" w:hAnsi="Calibri"/>
+          <w:sz w:val="24"/>
+          <w:szCs w:val="24"/>
+          <w:lang w:val="en-US"/>
+        </w:rPr>
         <w:t>u</w:t>
       </w:r>
+      <w:proofErr w:type="spellEnd"/>
       <w:r>
         <w:rPr>
           <w:rFonts w:ascii="Calibri" w:hAnsi="Calibri"/>
@@ -2323,8 +2432,19 @@
           <w:szCs w:val="24"/>
           <w:lang w:val="en-US"/>
         </w:rPr>
-        <w:t xml:space="preserve"> delu</w:t>
-      </w:r>
+        <w:t xml:space="preserve"> </w:t>
+      </w:r>
+      <w:proofErr w:type="spellStart"/>
+      <w:r>
+        <w:rPr>
+          <w:rFonts w:ascii="Calibri" w:hAnsi="Calibri"/>
+          <w:sz w:val="24"/>
+          <w:szCs w:val="24"/>
+          <w:lang w:val="en-US"/>
+        </w:rPr>
+        <w:t>delu</w:t>
+      </w:r>
+      <w:proofErr w:type="spellEnd"/>
       <w:r>
         <w:rPr>
           <w:rFonts w:ascii="Calibri" w:hAnsi="Calibri"/>
@@ -2352,6 +2472,7 @@
           <w:sz w:val="24"/>
           <w:szCs w:val="24"/>
         </w:rPr>
+        <w:lastRenderedPageBreak/>
         <w:t xml:space="preserve">izjave, ki se oddajo hkrati z elektronsko oddajo zaključnega dela (izjava o objavi osebnih podatkov, izjava o avtorstvu zaključnega dela, izjava o ustreznosti zaključnega dela, </w:t>
       </w:r>
       <w:r>
@@ -2680,6 +2801,7 @@
           <w:szCs w:val="36"/>
           <w:lang w:val="sl-SI"/>
         </w:rPr>
+        <w:lastRenderedPageBreak/>
         <w:t xml:space="preserve">POVZETEK IN VSEBINA </w:t>
       </w:r>
       <w:r>
@@ -3108,6 +3230,7 @@
           <w:sz w:val="24"/>
           <w:szCs w:val="24"/>
         </w:rPr>
+        <w:lastRenderedPageBreak/>
         <w:t>Reševanje problema pogostokrat</w:t>
       </w:r>
       <w:r>
@@ -3267,6 +3390,7 @@
           <w:szCs w:val="36"/>
           <w:lang w:val="sl-SI"/>
         </w:rPr>
+        <w:lastRenderedPageBreak/>
         <w:t xml:space="preserve">JEZIK </w:t>
       </w:r>
       <w:r>
@@ -3457,7 +3581,25 @@
           <w:sz w:val="24"/>
           <w:szCs w:val="24"/>
         </w:rPr>
-        <w:t xml:space="preserve">če so mentorji ali somentorji pri nalogi profesorji iz tujine, </w:t>
+        <w:t xml:space="preserve">če so mentorji ali </w:t>
+      </w:r>
+      <w:proofErr w:type="spellStart"/>
+      <w:r>
+        <w:rPr>
+          <w:rFonts w:ascii="Calibri" w:hAnsi="Calibri"/>
+          <w:sz w:val="24"/>
+          <w:szCs w:val="24"/>
+        </w:rPr>
+        <w:t>somentorji</w:t>
+      </w:r>
+      <w:proofErr w:type="spellEnd"/>
+      <w:r>
+        <w:rPr>
+          <w:rFonts w:ascii="Calibri" w:hAnsi="Calibri"/>
+          <w:sz w:val="24"/>
+          <w:szCs w:val="24"/>
+        </w:rPr>
+        <w:t xml:space="preserve"> pri nalogi profesorji iz tujine, </w:t>
       </w:r>
     </w:p>
     <w:p>
@@ -3815,6 +3957,7 @@
           <w:szCs w:val="36"/>
           <w:lang w:val="sl-SI"/>
         </w:rPr>
+        <w:lastRenderedPageBreak/>
         <w:t>ŠTEVILO STRANI</w:t>
       </w:r>
       <w:bookmarkEnd w:id="30"/>
@@ -4009,6 +4152,7 @@
           <w:szCs w:val="36"/>
           <w:lang w:val="sl-SI"/>
         </w:rPr>
+        <w:lastRenderedPageBreak/>
         <w:t xml:space="preserve">OBLIKA </w:t>
       </w:r>
       <w:r>
@@ -4098,8 +4242,9 @@
           <w:szCs w:val="24"/>
           <w:lang w:eastAsia="sl-SI"/>
         </w:rPr>
-        <w:t>Besedilo naj bo napisano s proporcionalno obliko pisave Calibri</w:t>
-      </w:r>
+        <w:t xml:space="preserve">Besedilo naj bo napisano s proporcionalno obliko pisave </w:t>
+      </w:r>
+      <w:proofErr w:type="spellStart"/>
       <w:r>
         <w:rPr>
           <w:rFonts w:ascii="Calibri" w:hAnsi="Calibri"/>
@@ -4107,6 +4252,16 @@
           <w:szCs w:val="24"/>
           <w:lang w:eastAsia="sl-SI"/>
         </w:rPr>
+        <w:t>Calibri</w:t>
+      </w:r>
+      <w:proofErr w:type="spellEnd"/>
+      <w:r>
+        <w:rPr>
+          <w:rFonts w:ascii="Calibri" w:hAnsi="Calibri"/>
+          <w:sz w:val="24"/>
+          <w:szCs w:val="24"/>
+          <w:lang w:eastAsia="sl-SI"/>
+        </w:rPr>
         <w:t xml:space="preserve"> </w:t>
       </w:r>
       <w:r>
@@ -4161,8 +4316,19 @@
           <w:szCs w:val="24"/>
           <w:lang w:eastAsia="sl-SI"/>
         </w:rPr>
-        <w:t xml:space="preserve"> v okolju LaTeX</w:t>
-      </w:r>
+        <w:t xml:space="preserve"> v okolju </w:t>
+      </w:r>
+      <w:proofErr w:type="spellStart"/>
+      <w:r>
+        <w:rPr>
+          <w:rFonts w:ascii="Calibri" w:hAnsi="Calibri"/>
+          <w:sz w:val="24"/>
+          <w:szCs w:val="24"/>
+          <w:lang w:eastAsia="sl-SI"/>
+        </w:rPr>
+        <w:t>LaTeX</w:t>
+      </w:r>
+      <w:proofErr w:type="spellEnd"/>
       <w:r>
         <w:rPr>
           <w:rFonts w:ascii="Calibri" w:hAnsi="Calibri"/>
@@ -4682,6 +4848,7 @@
                 <w:color w:val="auto"/>
               </w:rPr>
             </w:pPr>
+            <w:proofErr w:type="spellStart"/>
             <w:r>
               <w:rPr>
                 <w:rFonts w:ascii="Calibri" w:hAnsi="Calibri"/>
@@ -4689,6 +4856,7 @@
               </w:rPr>
               <w:t>Calibri</w:t>
             </w:r>
+            <w:proofErr w:type="spellEnd"/>
           </w:p>
         </w:tc>
         <w:tc>
@@ -4921,6 +5089,7 @@
                 <w:color w:val="auto"/>
               </w:rPr>
             </w:pPr>
+            <w:proofErr w:type="spellStart"/>
             <w:r>
               <w:rPr>
                 <w:rFonts w:ascii="Calibri" w:hAnsi="Calibri"/>
@@ -4928,6 +5097,7 @@
               </w:rPr>
               <w:t>Calibri</w:t>
             </w:r>
+            <w:proofErr w:type="spellEnd"/>
           </w:p>
         </w:tc>
         <w:tc>
@@ -5126,6 +5296,7 @@
                 <w:color w:val="auto"/>
               </w:rPr>
             </w:pPr>
+            <w:proofErr w:type="spellStart"/>
             <w:r>
               <w:rPr>
                 <w:rFonts w:ascii="Calibri" w:hAnsi="Calibri"/>
@@ -5133,6 +5304,7 @@
               </w:rPr>
               <w:t>Calibri</w:t>
             </w:r>
+            <w:proofErr w:type="spellEnd"/>
           </w:p>
         </w:tc>
         <w:tc>
@@ -5312,6 +5484,7 @@
                 <w:color w:val="auto"/>
               </w:rPr>
             </w:pPr>
+            <w:proofErr w:type="spellStart"/>
             <w:r>
               <w:rPr>
                 <w:rFonts w:ascii="Calibri" w:hAnsi="Calibri"/>
@@ -5319,6 +5492,7 @@
               </w:rPr>
               <w:t>Calibri</w:t>
             </w:r>
+            <w:proofErr w:type="spellEnd"/>
           </w:p>
         </w:tc>
         <w:tc>
@@ -5513,6 +5687,7 @@
               </w:rPr>
               <w:t xml:space="preserve">      </w:t>
             </w:r>
+            <w:proofErr w:type="spellStart"/>
             <w:r>
               <w:rPr>
                 <w:rFonts w:ascii="Calibri" w:hAnsi="Calibri"/>
@@ -5520,6 +5695,7 @@
               </w:rPr>
               <w:t>Calibri</w:t>
             </w:r>
+            <w:proofErr w:type="spellEnd"/>
           </w:p>
         </w:tc>
         <w:tc>
@@ -5702,6 +5878,7 @@
                 <w:color w:val="auto"/>
               </w:rPr>
             </w:pPr>
+            <w:proofErr w:type="spellStart"/>
             <w:r>
               <w:rPr>
                 <w:rFonts w:ascii="Calibri" w:hAnsi="Calibri"/>
@@ -5709,6 +5886,7 @@
               </w:rPr>
               <w:t>Calibri</w:t>
             </w:r>
+            <w:proofErr w:type="spellEnd"/>
           </w:p>
         </w:tc>
         <w:tc>
@@ -6057,7 +6235,25 @@
           <w:sz w:val="24"/>
           <w:szCs w:val="24"/>
         </w:rPr>
-        <w:t>, če so enovrstični, če so večvrstični pa naj bodo poravnani obojestransko</w:t>
+        <w:t xml:space="preserve">, če so enovrstični, če so </w:t>
+      </w:r>
+      <w:proofErr w:type="spellStart"/>
+      <w:r>
+        <w:rPr>
+          <w:rFonts w:ascii="Calibri" w:hAnsi="Calibri"/>
+          <w:sz w:val="24"/>
+          <w:szCs w:val="24"/>
+        </w:rPr>
+        <w:t>večvrstični</w:t>
+      </w:r>
+      <w:proofErr w:type="spellEnd"/>
+      <w:r>
+        <w:rPr>
+          <w:rFonts w:ascii="Calibri" w:hAnsi="Calibri"/>
+          <w:sz w:val="24"/>
+          <w:szCs w:val="24"/>
+        </w:rPr>
+        <w:t xml:space="preserve"> pa naj bodo poravnani obojestransko</w:t>
       </w:r>
       <w:r>
         <w:rPr>
@@ -6224,14 +6420,14 @@
             <v:path o:extrusionok="f" gradientshapeok="t" o:connecttype="rect"/>
             <o:lock v:ext="edit" aspectratio="t"/>
           </v:shapetype>
-          <v:shape id="_x0000_i1025" type="#_x0000_t75" style="width:434.2pt;height:174pt" o:ole="" o:bordertopcolor="this" o:borderleftcolor="this" o:borderbottomcolor="this" o:borderrightcolor="this">
+          <v:shape id="_x0000_i1025" type="#_x0000_t75" style="width:434.05pt;height:173.9pt" o:ole="" o:bordertopcolor="this" o:borderleftcolor="this" o:borderbottomcolor="this" o:borderrightcolor="this">
             <v:imagedata r:id="rId20" o:title=""/>
             <w10:bordertop type="single" width="6"/>
             <w10:borderleft type="single" width="6"/>
             <w10:borderbottom type="single" width="6"/>
             <w10:borderright type="single" width="6"/>
           </v:shape>
-          <o:OLEObject Type="Embed" ProgID="Word.Picture.8" ShapeID="_x0000_i1025" DrawAspect="Content" ObjectID="_1832416860" r:id="rId21"/>
+          <o:OLEObject Type="Embed" ProgID="Word.Picture.8" ShapeID="_x0000_i1025" DrawAspect="Content" ObjectID="_1832593772" r:id="rId21"/>
         </w:object>
       </w:r>
     </w:p>
@@ -6498,34 +6694,9 @@
             <w:sz w:val="24"/>
             <w:szCs w:val="24"/>
           </w:rPr>
-          <w:t>ISO 31-11 - Wikipedia</w:t>
+          <w:t xml:space="preserve">ISO 31-11 - </w:t>
         </w:r>
-      </w:hyperlink>
-      <w:r>
-        <w:rPr>
-          <w:rFonts w:ascii="Calibri" w:hAnsi="Calibri"/>
-          <w:sz w:val="24"/>
-          <w:szCs w:val="24"/>
-        </w:rPr>
-        <w:t xml:space="preserve">, </w:t>
-      </w:r>
-      <w:r>
-        <w:rPr>
-          <w:rFonts w:ascii="Calibri" w:hAnsi="Calibri"/>
-          <w:sz w:val="24"/>
-          <w:szCs w:val="24"/>
-        </w:rPr>
-        <w:t xml:space="preserve">ki definira uporabo znakov in simbolov v naravoslovju, tehniki in matematiki. Fizikalne enačbe oziroma izračuni morajo biti vedno opremljeni z  enotami, skladno s sistemom SI </w:t>
-      </w:r>
-      <w:r>
-        <w:rPr>
-          <w:rFonts w:ascii="Calibri" w:hAnsi="Calibri"/>
-          <w:sz w:val="24"/>
-          <w:szCs w:val="24"/>
-        </w:rPr>
-        <w:t>(</w:t>
-      </w:r>
-      <w:hyperlink r:id="rId23" w:history="1">
+        <w:proofErr w:type="spellStart"/>
         <w:r>
           <w:rPr>
             <w:rStyle w:val="Hyperlink"/>
@@ -6533,8 +6704,9 @@
             <w:sz w:val="24"/>
             <w:szCs w:val="24"/>
           </w:rPr>
-          <w:t>International System of Units - Wikipedia</w:t>
+          <w:t>Wikipedia</w:t>
         </w:r>
+        <w:proofErr w:type="spellEnd"/>
       </w:hyperlink>
       <w:r>
         <w:rPr>
@@ -6542,6 +6714,133 @@
           <w:sz w:val="24"/>
           <w:szCs w:val="24"/>
         </w:rPr>
+        <w:t xml:space="preserve">, </w:t>
+      </w:r>
+      <w:r>
+        <w:rPr>
+          <w:rFonts w:ascii="Calibri" w:hAnsi="Calibri"/>
+          <w:sz w:val="24"/>
+          <w:szCs w:val="24"/>
+        </w:rPr>
+        <w:t xml:space="preserve">ki definira uporabo znakov in simbolov v naravoslovju, tehniki in matematiki. Fizikalne enačbe oziroma izračuni morajo biti vedno opremljeni z  enotami, skladno s sistemom SI </w:t>
+      </w:r>
+      <w:r>
+        <w:rPr>
+          <w:rFonts w:ascii="Calibri" w:hAnsi="Calibri"/>
+          <w:sz w:val="24"/>
+          <w:szCs w:val="24"/>
+        </w:rPr>
+        <w:t>(</w:t>
+      </w:r>
+      <w:proofErr w:type="spellStart"/>
+      <w:r>
+        <w:fldChar w:fldCharType="begin"/>
+      </w:r>
+      <w:r>
+        <w:instrText>HYPERLINK "https://en.wikipedia.org/wiki/International_System_of_Units"</w:instrText>
+      </w:r>
+      <w:r>
+        <w:fldChar w:fldCharType="separate"/>
+      </w:r>
+      <w:r>
+        <w:rPr>
+          <w:rStyle w:val="Hyperlink"/>
+          <w:rFonts w:ascii="Calibri" w:hAnsi="Calibri" w:cs="Arial"/>
+          <w:sz w:val="24"/>
+          <w:szCs w:val="24"/>
+        </w:rPr>
+        <w:t>International</w:t>
+      </w:r>
+      <w:proofErr w:type="spellEnd"/>
+      <w:r>
+        <w:rPr>
+          <w:rStyle w:val="Hyperlink"/>
+          <w:rFonts w:ascii="Calibri" w:hAnsi="Calibri" w:cs="Arial"/>
+          <w:sz w:val="24"/>
+          <w:szCs w:val="24"/>
+        </w:rPr>
+        <w:t xml:space="preserve"> </w:t>
+      </w:r>
+      <w:proofErr w:type="spellStart"/>
+      <w:r>
+        <w:rPr>
+          <w:rStyle w:val="Hyperlink"/>
+          <w:rFonts w:ascii="Calibri" w:hAnsi="Calibri" w:cs="Arial"/>
+          <w:sz w:val="24"/>
+          <w:szCs w:val="24"/>
+        </w:rPr>
+        <w:t>System</w:t>
+      </w:r>
+      <w:proofErr w:type="spellEnd"/>
+      <w:r>
+        <w:rPr>
+          <w:rStyle w:val="Hyperlink"/>
+          <w:rFonts w:ascii="Calibri" w:hAnsi="Calibri" w:cs="Arial"/>
+          <w:sz w:val="24"/>
+          <w:szCs w:val="24"/>
+        </w:rPr>
+        <w:t xml:space="preserve"> </w:t>
+      </w:r>
+      <w:proofErr w:type="spellStart"/>
+      <w:r>
+        <w:rPr>
+          <w:rStyle w:val="Hyperlink"/>
+          <w:rFonts w:ascii="Calibri" w:hAnsi="Calibri" w:cs="Arial"/>
+          <w:sz w:val="24"/>
+          <w:szCs w:val="24"/>
+        </w:rPr>
+        <w:t>of</w:t>
+      </w:r>
+      <w:proofErr w:type="spellEnd"/>
+      <w:r>
+        <w:rPr>
+          <w:rStyle w:val="Hyperlink"/>
+          <w:rFonts w:ascii="Calibri" w:hAnsi="Calibri" w:cs="Arial"/>
+          <w:sz w:val="24"/>
+          <w:szCs w:val="24"/>
+        </w:rPr>
+        <w:t xml:space="preserve"> </w:t>
+      </w:r>
+      <w:proofErr w:type="spellStart"/>
+      <w:r>
+        <w:rPr>
+          <w:rStyle w:val="Hyperlink"/>
+          <w:rFonts w:ascii="Calibri" w:hAnsi="Calibri" w:cs="Arial"/>
+          <w:sz w:val="24"/>
+          <w:szCs w:val="24"/>
+        </w:rPr>
+        <w:t>Units</w:t>
+      </w:r>
+      <w:proofErr w:type="spellEnd"/>
+      <w:r>
+        <w:rPr>
+          <w:rStyle w:val="Hyperlink"/>
+          <w:rFonts w:ascii="Calibri" w:hAnsi="Calibri" w:cs="Arial"/>
+          <w:sz w:val="24"/>
+          <w:szCs w:val="24"/>
+        </w:rPr>
+        <w:t xml:space="preserve"> - </w:t>
+      </w:r>
+      <w:proofErr w:type="spellStart"/>
+      <w:r>
+        <w:rPr>
+          <w:rStyle w:val="Hyperlink"/>
+          <w:rFonts w:ascii="Calibri" w:hAnsi="Calibri" w:cs="Arial"/>
+          <w:sz w:val="24"/>
+          <w:szCs w:val="24"/>
+        </w:rPr>
+        <w:t>Wikipedia</w:t>
+      </w:r>
+      <w:proofErr w:type="spellEnd"/>
+      <w:r>
+        <w:fldChar w:fldCharType="end"/>
+      </w:r>
+      <w:r>
+        <w:rPr>
+          <w:rFonts w:ascii="Calibri" w:hAnsi="Calibri"/>
+          <w:sz w:val="24"/>
+          <w:szCs w:val="24"/>
+        </w:rPr>
         <w:t>)</w:t>
       </w:r>
       <w:r>
@@ -6559,7 +6858,16 @@
           <w:sz w:val="24"/>
           <w:szCs w:val="24"/>
         </w:rPr>
-        <w:t xml:space="preserve"> Simbole za fizikalne količine in matematične spremenljivke pišite ležeče (razen grških simbolov) v enaki velikosti kot besedilo. Enačbe nikoli ne pišite v tekstovnem načinu, obvezno uporabite ustrezen matematični urejevalnik. Vsi elementi matematičnih izrazov morajo biti definirani v besedilu neposredno pred izrazom ali takoj za njim. Enot ne pišemo v matematičnem načinu, temveč v tekstovnem. Enačbe zamaknite </w:t>
+        <w:t xml:space="preserve"> Simbole za fizikalne količine in matematične spremenljivke pišite ležeče (razen grških simbolov) v enaki velikosti kot besedilo. Enačbe nikoli ne pišite v tekstovnem načinu, obvezno uporabite ustrezen matematični urejevalnik. Vsi elementi matematičnih izrazov </w:t>
+      </w:r>
+      <w:r>
+        <w:rPr>
+          <w:rFonts w:ascii="Calibri" w:hAnsi="Calibri"/>
+          <w:sz w:val="24"/>
+          <w:szCs w:val="24"/>
+        </w:rPr>
+        <w:lastRenderedPageBreak/>
+        <w:t xml:space="preserve">morajo biti definirani v besedilu neposredno pred izrazom ali takoj za njim. Enot ne pišemo v matematičnem načinu, temveč v tekstovnem. Enačbe zamaknite </w:t>
       </w:r>
       <w:smartTag w:uri="urn:schemas-microsoft-com:office:smarttags" w:element="metricconverter">
         <w:smartTagPr>
@@ -6605,10 +6913,10 @@
           <w:szCs w:val="24"/>
         </w:rPr>
         <w:object w:dxaOrig="1219" w:dyaOrig="660" w14:anchorId="3664D413">
-          <v:shape id="_x0000_i1026" type="#_x0000_t75" style="width:60pt;height:32.2pt" o:ole="">
-            <v:imagedata r:id="rId24" o:title=""/>
+          <v:shape id="_x0000_i1026" type="#_x0000_t75" style="width:59.75pt;height:32.6pt" o:ole="">
+            <v:imagedata r:id="rId23" o:title=""/>
           </v:shape>
-          <o:OLEObject Type="Embed" ProgID="Equation.3" ShapeID="_x0000_i1026" DrawAspect="Content" ObjectID="_1832416861" r:id="rId25"/>
+          <o:OLEObject Type="Embed" ProgID="Equation.3" ShapeID="_x0000_i1026" DrawAspect="Content" ObjectID="_1832593773" r:id="rId24"/>
         </w:object>
       </w:r>
       <w:r>
@@ -7308,8 +7616,18 @@
           <w:sz w:val="24"/>
           <w:szCs w:val="24"/>
         </w:rPr>
-        <w:t>Opombe naj bodo oštevilčene nadpisano</w:t>
-      </w:r>
+        <w:t xml:space="preserve">Opombe naj bodo oštevilčene </w:t>
+      </w:r>
+      <w:proofErr w:type="spellStart"/>
+      <w:r>
+        <w:rPr>
+          <w:rFonts w:ascii="Calibri" w:hAnsi="Calibri"/>
+          <w:sz w:val="24"/>
+          <w:szCs w:val="24"/>
+        </w:rPr>
+        <w:t>nadpisano</w:t>
+      </w:r>
+      <w:proofErr w:type="spellEnd"/>
       <w:r>
         <w:rPr>
           <w:rStyle w:val="FootnoteReference"/>
@@ -7351,6 +7669,7 @@
           <w:sz w:val="24"/>
           <w:szCs w:val="24"/>
         </w:rPr>
+        <w:lastRenderedPageBreak/>
         <w:t xml:space="preserve">Seznam citiranih virov naj bo urejen po abecednem vrstnem redu priimkov avtorjev in oštevilčen z zaporednimi številkami. V vsebini </w:t>
       </w:r>
       <w:r>
@@ -7709,9 +8028,63 @@
           <w:sz w:val="24"/>
           <w:szCs w:val="24"/>
         </w:rPr>
-        <w:t xml:space="preserve">Za citiranje in urejanje virov in literature se priporoča uporaba programskega orodja za citiranje in organizacijo referenc npr. EndNote, Zotero, Mendeley, Microsoftovo orodje v Wordu in drugi. Navodila za uporabo takšnih orodij so dostopna v </w:t>
-      </w:r>
-      <w:hyperlink r:id="rId26" w:history="1">
+        <w:t xml:space="preserve">Za citiranje in urejanje virov in literature se priporoča uporaba programskega orodja za citiranje in organizacijo referenc npr. </w:t>
+      </w:r>
+      <w:proofErr w:type="spellStart"/>
+      <w:r>
+        <w:rPr>
+          <w:rFonts w:ascii="Calibri" w:hAnsi="Calibri"/>
+          <w:sz w:val="24"/>
+          <w:szCs w:val="24"/>
+        </w:rPr>
+        <w:t>EndNote</w:t>
+      </w:r>
+      <w:proofErr w:type="spellEnd"/>
+      <w:r>
+        <w:rPr>
+          <w:rFonts w:ascii="Calibri" w:hAnsi="Calibri"/>
+          <w:sz w:val="24"/>
+          <w:szCs w:val="24"/>
+        </w:rPr>
+        <w:t xml:space="preserve">, </w:t>
+      </w:r>
+      <w:proofErr w:type="spellStart"/>
+      <w:r>
+        <w:rPr>
+          <w:rFonts w:ascii="Calibri" w:hAnsi="Calibri"/>
+          <w:sz w:val="24"/>
+          <w:szCs w:val="24"/>
+        </w:rPr>
+        <w:t>Zotero</w:t>
+      </w:r>
+      <w:proofErr w:type="spellEnd"/>
+      <w:r>
+        <w:rPr>
+          <w:rFonts w:ascii="Calibri" w:hAnsi="Calibri"/>
+          <w:sz w:val="24"/>
+          <w:szCs w:val="24"/>
+        </w:rPr>
+        <w:t xml:space="preserve">, </w:t>
+      </w:r>
+      <w:proofErr w:type="spellStart"/>
+      <w:r>
+        <w:rPr>
+          <w:rFonts w:ascii="Calibri" w:hAnsi="Calibri"/>
+          <w:sz w:val="24"/>
+          <w:szCs w:val="24"/>
+        </w:rPr>
+        <w:t>Mendeley</w:t>
+      </w:r>
+      <w:proofErr w:type="spellEnd"/>
+      <w:r>
+        <w:rPr>
+          <w:rFonts w:ascii="Calibri" w:hAnsi="Calibri"/>
+          <w:sz w:val="24"/>
+          <w:szCs w:val="24"/>
+        </w:rPr>
+        <w:t xml:space="preserve">, Microsoftovo orodje v Wordu in drugi. Navodila za uporabo takšnih orodij so dostopna v </w:t>
+      </w:r>
+      <w:hyperlink r:id="rId25" w:history="1">
         <w:r>
           <w:rPr>
             <w:rStyle w:val="Hyperlink"/>
@@ -7750,6 +8123,7 @@
           <w:szCs w:val="36"/>
           <w:lang w:val="sl-SI"/>
         </w:rPr>
+        <w:lastRenderedPageBreak/>
         <w:t>NAVAJANJE VIROV</w:t>
       </w:r>
       <w:bookmarkEnd w:id="169"/>
@@ -8054,13 +8428,23 @@
           <w:szCs w:val="24"/>
         </w:rPr>
       </w:pPr>
-      <w:r>
-        <w:rPr>
-          <w:rFonts w:ascii="Calibri" w:hAnsi="Calibri"/>
-          <w:sz w:val="24"/>
-          <w:szCs w:val="24"/>
-        </w:rPr>
-        <w:t xml:space="preserve">Đonlagič, D., Završnik M. </w:t>
+      <w:proofErr w:type="spellStart"/>
+      <w:r>
+        <w:rPr>
+          <w:rFonts w:ascii="Calibri" w:hAnsi="Calibri"/>
+          <w:sz w:val="24"/>
+          <w:szCs w:val="24"/>
+        </w:rPr>
+        <w:t>Đonlagič</w:t>
+      </w:r>
+      <w:proofErr w:type="spellEnd"/>
+      <w:r>
+        <w:rPr>
+          <w:rFonts w:ascii="Calibri" w:hAnsi="Calibri"/>
+          <w:sz w:val="24"/>
+          <w:szCs w:val="24"/>
+        </w:rPr>
+        <w:t xml:space="preserve">, D., Završnik M. </w:t>
       </w:r>
       <w:r>
         <w:rPr>
@@ -8228,14 +8612,61 @@
           <w:szCs w:val="24"/>
         </w:rPr>
       </w:pPr>
-      <w:r>
-        <w:rPr>
-          <w:rFonts w:ascii="Calibri" w:hAnsi="Calibri"/>
-          <w:sz w:val="24"/>
-          <w:szCs w:val="24"/>
-        </w:rPr>
-        <w:t xml:space="preserve">Kangassalo, H., Jaakkola, H., Welzer-Družovec, T. (ur.). </w:t>
-      </w:r>
+      <w:proofErr w:type="spellStart"/>
+      <w:r>
+        <w:rPr>
+          <w:rFonts w:ascii="Calibri" w:hAnsi="Calibri"/>
+          <w:sz w:val="24"/>
+          <w:szCs w:val="24"/>
+        </w:rPr>
+        <w:t>Kangassalo</w:t>
+      </w:r>
+      <w:proofErr w:type="spellEnd"/>
+      <w:r>
+        <w:rPr>
+          <w:rFonts w:ascii="Calibri" w:hAnsi="Calibri"/>
+          <w:sz w:val="24"/>
+          <w:szCs w:val="24"/>
+        </w:rPr>
+        <w:t xml:space="preserve">, H., </w:t>
+      </w:r>
+      <w:proofErr w:type="spellStart"/>
+      <w:r>
+        <w:rPr>
+          <w:rFonts w:ascii="Calibri" w:hAnsi="Calibri"/>
+          <w:sz w:val="24"/>
+          <w:szCs w:val="24"/>
+        </w:rPr>
+        <w:t>Jaakkola</w:t>
+      </w:r>
+      <w:proofErr w:type="spellEnd"/>
+      <w:r>
+        <w:rPr>
+          <w:rFonts w:ascii="Calibri" w:hAnsi="Calibri"/>
+          <w:sz w:val="24"/>
+          <w:szCs w:val="24"/>
+        </w:rPr>
+        <w:t xml:space="preserve">, H., </w:t>
+      </w:r>
+      <w:proofErr w:type="spellStart"/>
+      <w:r>
+        <w:rPr>
+          <w:rFonts w:ascii="Calibri" w:hAnsi="Calibri"/>
+          <w:sz w:val="24"/>
+          <w:szCs w:val="24"/>
+        </w:rPr>
+        <w:t>Welzer-Družovec</w:t>
+      </w:r>
+      <w:proofErr w:type="spellEnd"/>
+      <w:r>
+        <w:rPr>
+          <w:rFonts w:ascii="Calibri" w:hAnsi="Calibri"/>
+          <w:sz w:val="24"/>
+          <w:szCs w:val="24"/>
+        </w:rPr>
+        <w:t xml:space="preserve">, T. (ur.). </w:t>
+      </w:r>
+      <w:proofErr w:type="spellStart"/>
       <w:r>
         <w:rPr>
           <w:rFonts w:ascii="Calibri" w:hAnsi="Calibri"/>
@@ -8243,15 +8674,123 @@
           <w:sz w:val="24"/>
           <w:szCs w:val="24"/>
         </w:rPr>
-        <w:t xml:space="preserve">Information modelling and knowledge databases XIII. </w:t>
-      </w:r>
-      <w:r>
-        <w:rPr>
-          <w:rFonts w:ascii="Calibri" w:hAnsi="Calibri"/>
-          <w:sz w:val="24"/>
-          <w:szCs w:val="24"/>
-        </w:rPr>
-        <w:t xml:space="preserve">Amsterdam: IOS Press, 2002. </w:t>
+        <w:t>Information</w:t>
+      </w:r>
+      <w:proofErr w:type="spellEnd"/>
+      <w:r>
+        <w:rPr>
+          <w:rFonts w:ascii="Calibri" w:hAnsi="Calibri"/>
+          <w:i/>
+          <w:sz w:val="24"/>
+          <w:szCs w:val="24"/>
+        </w:rPr>
+        <w:t xml:space="preserve"> </w:t>
+      </w:r>
+      <w:proofErr w:type="spellStart"/>
+      <w:r>
+        <w:rPr>
+          <w:rFonts w:ascii="Calibri" w:hAnsi="Calibri"/>
+          <w:i/>
+          <w:sz w:val="24"/>
+          <w:szCs w:val="24"/>
+        </w:rPr>
+        <w:t>modelling</w:t>
+      </w:r>
+      <w:proofErr w:type="spellEnd"/>
+      <w:r>
+        <w:rPr>
+          <w:rFonts w:ascii="Calibri" w:hAnsi="Calibri"/>
+          <w:i/>
+          <w:sz w:val="24"/>
+          <w:szCs w:val="24"/>
+        </w:rPr>
+        <w:t xml:space="preserve"> </w:t>
+      </w:r>
+      <w:proofErr w:type="spellStart"/>
+      <w:r>
+        <w:rPr>
+          <w:rFonts w:ascii="Calibri" w:hAnsi="Calibri"/>
+          <w:i/>
+          <w:sz w:val="24"/>
+          <w:szCs w:val="24"/>
+        </w:rPr>
+        <w:t>and</w:t>
+      </w:r>
+      <w:proofErr w:type="spellEnd"/>
+      <w:r>
+        <w:rPr>
+          <w:rFonts w:ascii="Calibri" w:hAnsi="Calibri"/>
+          <w:i/>
+          <w:sz w:val="24"/>
+          <w:szCs w:val="24"/>
+        </w:rPr>
+        <w:t xml:space="preserve"> </w:t>
+      </w:r>
+      <w:proofErr w:type="spellStart"/>
+      <w:r>
+        <w:rPr>
+          <w:rFonts w:ascii="Calibri" w:hAnsi="Calibri"/>
+          <w:i/>
+          <w:sz w:val="24"/>
+          <w:szCs w:val="24"/>
+        </w:rPr>
+        <w:t>knowledge</w:t>
+      </w:r>
+      <w:proofErr w:type="spellEnd"/>
+      <w:r>
+        <w:rPr>
+          <w:rFonts w:ascii="Calibri" w:hAnsi="Calibri"/>
+          <w:i/>
+          <w:sz w:val="24"/>
+          <w:szCs w:val="24"/>
+        </w:rPr>
+        <w:t xml:space="preserve"> </w:t>
+      </w:r>
+      <w:proofErr w:type="spellStart"/>
+      <w:r>
+        <w:rPr>
+          <w:rFonts w:ascii="Calibri" w:hAnsi="Calibri"/>
+          <w:i/>
+          <w:sz w:val="24"/>
+          <w:szCs w:val="24"/>
+        </w:rPr>
+        <w:t>databases</w:t>
+      </w:r>
+      <w:proofErr w:type="spellEnd"/>
+      <w:r>
+        <w:rPr>
+          <w:rFonts w:ascii="Calibri" w:hAnsi="Calibri"/>
+          <w:i/>
+          <w:sz w:val="24"/>
+          <w:szCs w:val="24"/>
+        </w:rPr>
+        <w:t xml:space="preserve"> XIII. </w:t>
+      </w:r>
+      <w:r>
+        <w:rPr>
+          <w:rFonts w:ascii="Calibri" w:hAnsi="Calibri"/>
+          <w:sz w:val="24"/>
+          <w:szCs w:val="24"/>
+        </w:rPr>
+        <w:t xml:space="preserve">Amsterdam: IOS </w:t>
+      </w:r>
+      <w:proofErr w:type="spellStart"/>
+      <w:r>
+        <w:rPr>
+          <w:rFonts w:ascii="Calibri" w:hAnsi="Calibri"/>
+          <w:sz w:val="24"/>
+          <w:szCs w:val="24"/>
+        </w:rPr>
+        <w:t>Press</w:t>
+      </w:r>
+      <w:proofErr w:type="spellEnd"/>
+      <w:r>
+        <w:rPr>
+          <w:rFonts w:ascii="Calibri" w:hAnsi="Calibri"/>
+          <w:sz w:val="24"/>
+          <w:szCs w:val="24"/>
+        </w:rPr>
+        <w:t xml:space="preserve">, 2002. </w:t>
       </w:r>
     </w:p>
     <w:p>
@@ -8450,14 +8989,133 @@
           <w:szCs w:val="24"/>
         </w:rPr>
       </w:pPr>
-      <w:r>
-        <w:rPr>
-          <w:rFonts w:ascii="Calibri" w:hAnsi="Calibri"/>
-          <w:sz w:val="24"/>
-          <w:szCs w:val="24"/>
-        </w:rPr>
-        <w:t xml:space="preserve">Zazula, D., Karlsson, S., Doncarli, C. Advanced signal processing techniques. V: Merletti, R., Parker, P. (ur.). </w:t>
-      </w:r>
+      <w:proofErr w:type="spellStart"/>
+      <w:r>
+        <w:rPr>
+          <w:rFonts w:ascii="Calibri" w:hAnsi="Calibri"/>
+          <w:sz w:val="24"/>
+          <w:szCs w:val="24"/>
+        </w:rPr>
+        <w:t>Zazula</w:t>
+      </w:r>
+      <w:proofErr w:type="spellEnd"/>
+      <w:r>
+        <w:rPr>
+          <w:rFonts w:ascii="Calibri" w:hAnsi="Calibri"/>
+          <w:sz w:val="24"/>
+          <w:szCs w:val="24"/>
+        </w:rPr>
+        <w:t xml:space="preserve">, D., </w:t>
+      </w:r>
+      <w:proofErr w:type="spellStart"/>
+      <w:r>
+        <w:rPr>
+          <w:rFonts w:ascii="Calibri" w:hAnsi="Calibri"/>
+          <w:sz w:val="24"/>
+          <w:szCs w:val="24"/>
+        </w:rPr>
+        <w:t>Karlsson</w:t>
+      </w:r>
+      <w:proofErr w:type="spellEnd"/>
+      <w:r>
+        <w:rPr>
+          <w:rFonts w:ascii="Calibri" w:hAnsi="Calibri"/>
+          <w:sz w:val="24"/>
+          <w:szCs w:val="24"/>
+        </w:rPr>
+        <w:t xml:space="preserve">, S., </w:t>
+      </w:r>
+      <w:proofErr w:type="spellStart"/>
+      <w:r>
+        <w:rPr>
+          <w:rFonts w:ascii="Calibri" w:hAnsi="Calibri"/>
+          <w:sz w:val="24"/>
+          <w:szCs w:val="24"/>
+        </w:rPr>
+        <w:t>Doncarli</w:t>
+      </w:r>
+      <w:proofErr w:type="spellEnd"/>
+      <w:r>
+        <w:rPr>
+          <w:rFonts w:ascii="Calibri" w:hAnsi="Calibri"/>
+          <w:sz w:val="24"/>
+          <w:szCs w:val="24"/>
+        </w:rPr>
+        <w:t xml:space="preserve">, C. </w:t>
+      </w:r>
+      <w:proofErr w:type="spellStart"/>
+      <w:r>
+        <w:rPr>
+          <w:rFonts w:ascii="Calibri" w:hAnsi="Calibri"/>
+          <w:sz w:val="24"/>
+          <w:szCs w:val="24"/>
+        </w:rPr>
+        <w:t>Advanced</w:t>
+      </w:r>
+      <w:proofErr w:type="spellEnd"/>
+      <w:r>
+        <w:rPr>
+          <w:rFonts w:ascii="Calibri" w:hAnsi="Calibri"/>
+          <w:sz w:val="24"/>
+          <w:szCs w:val="24"/>
+        </w:rPr>
+        <w:t xml:space="preserve"> signal </w:t>
+      </w:r>
+      <w:proofErr w:type="spellStart"/>
+      <w:r>
+        <w:rPr>
+          <w:rFonts w:ascii="Calibri" w:hAnsi="Calibri"/>
+          <w:sz w:val="24"/>
+          <w:szCs w:val="24"/>
+        </w:rPr>
+        <w:t>processing</w:t>
+      </w:r>
+      <w:proofErr w:type="spellEnd"/>
+      <w:r>
+        <w:rPr>
+          <w:rFonts w:ascii="Calibri" w:hAnsi="Calibri"/>
+          <w:sz w:val="24"/>
+          <w:szCs w:val="24"/>
+        </w:rPr>
+        <w:t xml:space="preserve"> </w:t>
+      </w:r>
+      <w:proofErr w:type="spellStart"/>
+      <w:r>
+        <w:rPr>
+          <w:rFonts w:ascii="Calibri" w:hAnsi="Calibri"/>
+          <w:sz w:val="24"/>
+          <w:szCs w:val="24"/>
+        </w:rPr>
+        <w:t>techniques</w:t>
+      </w:r>
+      <w:proofErr w:type="spellEnd"/>
+      <w:r>
+        <w:rPr>
+          <w:rFonts w:ascii="Calibri" w:hAnsi="Calibri"/>
+          <w:sz w:val="24"/>
+          <w:szCs w:val="24"/>
+        </w:rPr>
+        <w:t xml:space="preserve">. V: </w:t>
+      </w:r>
+      <w:proofErr w:type="spellStart"/>
+      <w:r>
+        <w:rPr>
+          <w:rFonts w:ascii="Calibri" w:hAnsi="Calibri"/>
+          <w:sz w:val="24"/>
+          <w:szCs w:val="24"/>
+        </w:rPr>
+        <w:t>Merletti</w:t>
+      </w:r>
+      <w:proofErr w:type="spellEnd"/>
+      <w:r>
+        <w:rPr>
+          <w:rFonts w:ascii="Calibri" w:hAnsi="Calibri"/>
+          <w:sz w:val="24"/>
+          <w:szCs w:val="24"/>
+        </w:rPr>
+        <w:t xml:space="preserve">, R., Parker, P. (ur.). </w:t>
+      </w:r>
+      <w:proofErr w:type="spellStart"/>
       <w:r>
         <w:rPr>
           <w:rFonts w:ascii="Calibri" w:hAnsi="Calibri"/>
@@ -8465,15 +9123,123 @@
           <w:sz w:val="24"/>
           <w:szCs w:val="24"/>
         </w:rPr>
-        <w:t xml:space="preserve">Electromyography: physiology, engineering, and noninvasive applications. </w:t>
-      </w:r>
-      <w:r>
-        <w:rPr>
-          <w:rFonts w:ascii="Calibri" w:hAnsi="Calibri"/>
-          <w:sz w:val="24"/>
-          <w:szCs w:val="24"/>
-        </w:rPr>
-        <w:t xml:space="preserve">New Jersey: John Wiley, 2004, str. 259–304. </w:t>
+        <w:t>Electromyography</w:t>
+      </w:r>
+      <w:proofErr w:type="spellEnd"/>
+      <w:r>
+        <w:rPr>
+          <w:rFonts w:ascii="Calibri" w:hAnsi="Calibri"/>
+          <w:i/>
+          <w:sz w:val="24"/>
+          <w:szCs w:val="24"/>
+        </w:rPr>
+        <w:t xml:space="preserve">: </w:t>
+      </w:r>
+      <w:proofErr w:type="spellStart"/>
+      <w:r>
+        <w:rPr>
+          <w:rFonts w:ascii="Calibri" w:hAnsi="Calibri"/>
+          <w:i/>
+          <w:sz w:val="24"/>
+          <w:szCs w:val="24"/>
+        </w:rPr>
+        <w:t>physiology</w:t>
+      </w:r>
+      <w:proofErr w:type="spellEnd"/>
+      <w:r>
+        <w:rPr>
+          <w:rFonts w:ascii="Calibri" w:hAnsi="Calibri"/>
+          <w:i/>
+          <w:sz w:val="24"/>
+          <w:szCs w:val="24"/>
+        </w:rPr>
+        <w:t xml:space="preserve">, engineering, </w:t>
+      </w:r>
+      <w:proofErr w:type="spellStart"/>
+      <w:r>
+        <w:rPr>
+          <w:rFonts w:ascii="Calibri" w:hAnsi="Calibri"/>
+          <w:i/>
+          <w:sz w:val="24"/>
+          <w:szCs w:val="24"/>
+        </w:rPr>
+        <w:t>and</w:t>
+      </w:r>
+      <w:proofErr w:type="spellEnd"/>
+      <w:r>
+        <w:rPr>
+          <w:rFonts w:ascii="Calibri" w:hAnsi="Calibri"/>
+          <w:i/>
+          <w:sz w:val="24"/>
+          <w:szCs w:val="24"/>
+        </w:rPr>
+        <w:t xml:space="preserve"> </w:t>
+      </w:r>
+      <w:proofErr w:type="spellStart"/>
+      <w:r>
+        <w:rPr>
+          <w:rFonts w:ascii="Calibri" w:hAnsi="Calibri"/>
+          <w:i/>
+          <w:sz w:val="24"/>
+          <w:szCs w:val="24"/>
+        </w:rPr>
+        <w:t>noninvasive</w:t>
+      </w:r>
+      <w:proofErr w:type="spellEnd"/>
+      <w:r>
+        <w:rPr>
+          <w:rFonts w:ascii="Calibri" w:hAnsi="Calibri"/>
+          <w:i/>
+          <w:sz w:val="24"/>
+          <w:szCs w:val="24"/>
+        </w:rPr>
+        <w:t xml:space="preserve"> </w:t>
+      </w:r>
+      <w:proofErr w:type="spellStart"/>
+      <w:r>
+        <w:rPr>
+          <w:rFonts w:ascii="Calibri" w:hAnsi="Calibri"/>
+          <w:i/>
+          <w:sz w:val="24"/>
+          <w:szCs w:val="24"/>
+        </w:rPr>
+        <w:t>applications</w:t>
+      </w:r>
+      <w:proofErr w:type="spellEnd"/>
+      <w:r>
+        <w:rPr>
+          <w:rFonts w:ascii="Calibri" w:hAnsi="Calibri"/>
+          <w:i/>
+          <w:sz w:val="24"/>
+          <w:szCs w:val="24"/>
+        </w:rPr>
+        <w:t xml:space="preserve">. </w:t>
+      </w:r>
+      <w:r>
+        <w:rPr>
+          <w:rFonts w:ascii="Calibri" w:hAnsi="Calibri"/>
+          <w:sz w:val="24"/>
+          <w:szCs w:val="24"/>
+        </w:rPr>
+        <w:t xml:space="preserve">New Jersey: John </w:t>
+      </w:r>
+      <w:proofErr w:type="spellStart"/>
+      <w:r>
+        <w:rPr>
+          <w:rFonts w:ascii="Calibri" w:hAnsi="Calibri"/>
+          <w:sz w:val="24"/>
+          <w:szCs w:val="24"/>
+        </w:rPr>
+        <w:t>Wiley</w:t>
+      </w:r>
+      <w:proofErr w:type="spellEnd"/>
+      <w:r>
+        <w:rPr>
+          <w:rFonts w:ascii="Calibri" w:hAnsi="Calibri"/>
+          <w:sz w:val="24"/>
+          <w:szCs w:val="24"/>
+        </w:rPr>
+        <w:t xml:space="preserve">, 2004, str. 259–304. </w:t>
       </w:r>
     </w:p>
     <w:p>
@@ -8667,7 +9433,25 @@
           <w:sz w:val="24"/>
           <w:szCs w:val="24"/>
         </w:rPr>
-        <w:t xml:space="preserve">Voršič, Ž., Pihler J., Voršič J. Uporaba polizoliranih vodnikov pri najvišjih napetostih. </w:t>
+        <w:t xml:space="preserve">Voršič, Ž., Pihler J., Voršič J. Uporaba </w:t>
+      </w:r>
+      <w:proofErr w:type="spellStart"/>
+      <w:r>
+        <w:rPr>
+          <w:rFonts w:ascii="Calibri" w:hAnsi="Calibri"/>
+          <w:sz w:val="24"/>
+          <w:szCs w:val="24"/>
+        </w:rPr>
+        <w:t>polizoliranih</w:t>
+      </w:r>
+      <w:proofErr w:type="spellEnd"/>
+      <w:r>
+        <w:rPr>
+          <w:rFonts w:ascii="Calibri" w:hAnsi="Calibri"/>
+          <w:sz w:val="24"/>
+          <w:szCs w:val="24"/>
+        </w:rPr>
+        <w:t xml:space="preserve"> vodnikov pri najvišjih napetostih. </w:t>
       </w:r>
       <w:r>
         <w:rPr>
@@ -8770,7 +9554,25 @@
           <w:sz w:val="24"/>
           <w:szCs w:val="24"/>
         </w:rPr>
-        <w:t>Ime konference z zaporedno številko (če je konferenca oštevilčena), kraj konference, datum konference. Kraj izdaje: Založba, letnica izdaje, prva in zadnja stran prispevka. Če je zbornik konference v več zvezkih/delih, pred obsegom strani prispevka navedemo še številko oz. oznako zvezka, npr.: zv. B, vol. 1, del 2, knj. 1 ipd.</w:t>
+        <w:t xml:space="preserve">Ime konference z zaporedno številko (če je konferenca oštevilčena), kraj konference, datum konference. Kraj izdaje: Založba, letnica izdaje, prva in zadnja stran prispevka. Če je zbornik konference v več zvezkih/delih, pred obsegom strani prispevka navedemo še številko oz. oznako zvezka, npr.: zv. B, vol. 1, del 2, </w:t>
+      </w:r>
+      <w:proofErr w:type="spellStart"/>
+      <w:r>
+        <w:rPr>
+          <w:rFonts w:ascii="Calibri" w:hAnsi="Calibri"/>
+          <w:sz w:val="24"/>
+          <w:szCs w:val="24"/>
+        </w:rPr>
+        <w:t>knj</w:t>
+      </w:r>
+      <w:proofErr w:type="spellEnd"/>
+      <w:r>
+        <w:rPr>
+          <w:rFonts w:ascii="Calibri" w:hAnsi="Calibri"/>
+          <w:sz w:val="24"/>
+          <w:szCs w:val="24"/>
+        </w:rPr>
+        <w:t>. 1 ipd.</w:t>
       </w:r>
     </w:p>
     <w:p>
@@ -8829,7 +9631,27 @@
           <w:szCs w:val="24"/>
           <w:lang w:eastAsia="sl-SI"/>
         </w:rPr>
-        <w:t xml:space="preserve">19. mednarodna elektrotehniška in računalniška konferenca ERK 2010, Portorož, 20.–22. september 2010. Ljubljana: IEEE Region 8, Slovenska sekcija IEEE, 2010, zv. B, str. 34–37. </w:t>
+        <w:t xml:space="preserve">19. mednarodna elektrotehniška in računalniška konferenca ERK 2010, Portorož, 20.–22. september 2010. Ljubljana: IEEE </w:t>
+      </w:r>
+      <w:proofErr w:type="spellStart"/>
+      <w:r>
+        <w:rPr>
+          <w:rFonts w:ascii="Calibri" w:hAnsi="Calibri"/>
+          <w:sz w:val="24"/>
+          <w:szCs w:val="24"/>
+          <w:lang w:eastAsia="sl-SI"/>
+        </w:rPr>
+        <w:t>Region</w:t>
+      </w:r>
+      <w:proofErr w:type="spellEnd"/>
+      <w:r>
+        <w:rPr>
+          <w:rFonts w:ascii="Calibri" w:hAnsi="Calibri"/>
+          <w:sz w:val="24"/>
+          <w:szCs w:val="24"/>
+          <w:lang w:eastAsia="sl-SI"/>
+        </w:rPr>
+        <w:t xml:space="preserve"> 8, Slovenska sekcija IEEE, 2010, zv. B, str. 34–37. </w:t>
       </w:r>
     </w:p>
     <w:p>
@@ -8967,13 +9789,23 @@
           <w:u w:val="single"/>
         </w:rPr>
       </w:pPr>
-      <w:r>
-        <w:rPr>
-          <w:rFonts w:ascii="Calibri" w:hAnsi="Calibri"/>
-          <w:sz w:val="24"/>
-          <w:szCs w:val="24"/>
-        </w:rPr>
-        <w:t xml:space="preserve">Milanovič, M. </w:t>
+      <w:proofErr w:type="spellStart"/>
+      <w:r>
+        <w:rPr>
+          <w:rFonts w:ascii="Calibri" w:hAnsi="Calibri"/>
+          <w:sz w:val="24"/>
+          <w:szCs w:val="24"/>
+        </w:rPr>
+        <w:t>Milanovič</w:t>
+      </w:r>
+      <w:proofErr w:type="spellEnd"/>
+      <w:r>
+        <w:rPr>
+          <w:rFonts w:ascii="Calibri" w:hAnsi="Calibri"/>
+          <w:sz w:val="24"/>
+          <w:szCs w:val="24"/>
+        </w:rPr>
+        <w:t xml:space="preserve">, M. </w:t>
       </w:r>
       <w:r>
         <w:rPr>
@@ -8983,7 +9815,29 @@
           <w:szCs w:val="24"/>
           <w:lang w:eastAsia="sl-SI"/>
         </w:rPr>
-        <w:t>Več-fazni dvosmerni DC - DC pretvorniški sistem za hibridna in električna vozila</w:t>
+        <w:t xml:space="preserve">Več-fazni dvosmerni DC - DC </w:t>
+      </w:r>
+      <w:proofErr w:type="spellStart"/>
+      <w:r>
+        <w:rPr>
+          <w:rFonts w:ascii="Calibri" w:hAnsi="Calibri"/>
+          <w:i/>
+          <w:sz w:val="24"/>
+          <w:szCs w:val="24"/>
+          <w:lang w:eastAsia="sl-SI"/>
+        </w:rPr>
+        <w:t>pretvorniški</w:t>
+      </w:r>
+      <w:proofErr w:type="spellEnd"/>
+      <w:r>
+        <w:rPr>
+          <w:rFonts w:ascii="Calibri" w:hAnsi="Calibri"/>
+          <w:i/>
+          <w:sz w:val="24"/>
+          <w:szCs w:val="24"/>
+          <w:lang w:eastAsia="sl-SI"/>
+        </w:rPr>
+        <w:t xml:space="preserve"> sistem za hibridna in električna vozila</w:t>
       </w:r>
       <w:r>
         <w:rPr>
@@ -9560,6 +10414,7 @@
           <w:szCs w:val="24"/>
           <w:u w:val="single"/>
         </w:rPr>
+        <w:lastRenderedPageBreak/>
         <w:t>Primer:</w:t>
       </w:r>
     </w:p>
@@ -9737,15 +10592,25 @@
           <w:lang w:eastAsia="sl-SI"/>
         </w:rPr>
       </w:pPr>
-      <w:r>
-        <w:rPr>
-          <w:rFonts w:ascii="Calibri" w:hAnsi="Calibri"/>
-          <w:sz w:val="24"/>
-          <w:szCs w:val="24"/>
-        </w:rPr>
-        <w:t xml:space="preserve">Dogša, T. CAE/CAD. Simulacija in modeliranje analognih vezij. Maribor: Fakulteta za elektrotehniko, računalništvo in informatiko, 2010. Dostopno na: </w:t>
-      </w:r>
-      <w:hyperlink r:id="rId27" w:history="1">
+      <w:proofErr w:type="spellStart"/>
+      <w:r>
+        <w:rPr>
+          <w:rFonts w:ascii="Calibri" w:hAnsi="Calibri"/>
+          <w:sz w:val="24"/>
+          <w:szCs w:val="24"/>
+        </w:rPr>
+        <w:t>Dogša</w:t>
+      </w:r>
+      <w:proofErr w:type="spellEnd"/>
+      <w:r>
+        <w:rPr>
+          <w:rFonts w:ascii="Calibri" w:hAnsi="Calibri"/>
+          <w:sz w:val="24"/>
+          <w:szCs w:val="24"/>
+        </w:rPr>
+        <w:t xml:space="preserve">, T. CAE/CAD. Simulacija in modeliranje analognih vezij. Maribor: Fakulteta za elektrotehniko, računalništvo in informatiko, 2010. Dostopno na: </w:t>
+      </w:r>
+      <w:hyperlink r:id="rId26" w:history="1">
         <w:r>
           <w:rPr>
             <w:rStyle w:val="Hyperlink"/>
@@ -9841,6 +10706,7 @@
           <w:szCs w:val="36"/>
           <w:lang w:val="sl-SI"/>
         </w:rPr>
+        <w:lastRenderedPageBreak/>
         <w:t>PRILOGE</w:t>
       </w:r>
       <w:r>
@@ -10074,7 +10940,25 @@
           <w:sz w:val="24"/>
           <w:szCs w:val="24"/>
         </w:rPr>
-        <w:t>na MS Teams oddati zaključno delo, skupaj z vsemi prilogami</w:t>
+        <w:t xml:space="preserve">na MS </w:t>
+      </w:r>
+      <w:proofErr w:type="spellStart"/>
+      <w:r>
+        <w:rPr>
+          <w:rFonts w:ascii="Calibri" w:hAnsi="Calibri"/>
+          <w:sz w:val="24"/>
+          <w:szCs w:val="24"/>
+        </w:rPr>
+        <w:t>Teams</w:t>
+      </w:r>
+      <w:proofErr w:type="spellEnd"/>
+      <w:r>
+        <w:rPr>
+          <w:rFonts w:ascii="Calibri" w:hAnsi="Calibri"/>
+          <w:sz w:val="24"/>
+          <w:szCs w:val="24"/>
+        </w:rPr>
+        <w:t xml:space="preserve"> oddati zaključno delo, skupaj z vsemi prilogami</w:t>
       </w:r>
       <w:r>
         <w:rPr>
@@ -10218,7 +11102,27 @@
           <w:sz w:val="24"/>
           <w:szCs w:val="24"/>
         </w:rPr>
-        <w:t xml:space="preserve"> podobnosti z drugimi deli. Študent ob oddaji vnese svoj in mentorjev ter somentorjev e-naslov, kamor bo poslano poročilo. </w:t>
+        <w:t xml:space="preserve"> podobnosti z drugimi deli. Študent ob oddaji vnese svoj in mentorjev ter </w:t>
+      </w:r>
+      <w:proofErr w:type="spellStart"/>
+      <w:r>
+        <w:rPr>
+          <w:rFonts w:ascii="Calibri" w:hAnsi="Calibri"/>
+          <w:color w:val="000000"/>
+          <w:sz w:val="24"/>
+          <w:szCs w:val="24"/>
+        </w:rPr>
+        <w:t>somentorjev</w:t>
+      </w:r>
+      <w:proofErr w:type="spellEnd"/>
+      <w:r>
+        <w:rPr>
+          <w:rFonts w:ascii="Calibri" w:hAnsi="Calibri"/>
+          <w:color w:val="000000"/>
+          <w:sz w:val="24"/>
+          <w:szCs w:val="24"/>
+        </w:rPr>
+        <w:t xml:space="preserve"> e-naslov, kamor bo poslano poročilo. </w:t>
       </w:r>
     </w:p>
     <w:p>
@@ -10505,6 +11409,7 @@
         </w:rPr>
         <w:t xml:space="preserve">morebitnega </w:t>
       </w:r>
+      <w:proofErr w:type="spellStart"/>
       <w:r>
         <w:rPr>
           <w:rFonts w:ascii="Calibri" w:hAnsi="Calibri"/>
@@ -10514,7 +11419,19 @@
           <w:sz w:val="24"/>
           <w:szCs w:val="24"/>
         </w:rPr>
-        <w:t>somentorja o ustreznosti zaključnega dela</w:t>
+        <w:t>somentorja</w:t>
+      </w:r>
+      <w:proofErr w:type="spellEnd"/>
+      <w:r>
+        <w:rPr>
+          <w:rFonts w:ascii="Calibri" w:hAnsi="Calibri"/>
+          <w:b/>
+          <w:i/>
+          <w:color w:val="000000"/>
+          <w:sz w:val="24"/>
+          <w:szCs w:val="24"/>
+        </w:rPr>
+        <w:t xml:space="preserve"> o ustreznosti zaključnega dela</w:t>
       </w:r>
       <w:r>
         <w:rPr>
@@ -11107,7 +12024,7 @@
         </w:rPr>
         <w:t xml:space="preserve"> dela je objavljena na spletni strani </w:t>
       </w:r>
-      <w:hyperlink r:id="rId28" w:history="1">
+      <w:hyperlink r:id="rId27" w:history="1">
         <w:r>
           <w:rPr>
             <w:rStyle w:val="Hyperlink"/>
@@ -11271,6 +12188,7 @@
           <w:sz w:val="32"/>
           <w:szCs w:val="32"/>
         </w:rPr>
+        <w:lastRenderedPageBreak/>
         <w:t xml:space="preserve">Priloga A </w:t>
       </w:r>
     </w:p>
@@ -11311,9 +12229,9 @@
           <w:szCs w:val="24"/>
         </w:rPr>
         <w:sectPr>
-          <w:headerReference w:type="even" r:id="rId29"/>
-          <w:headerReference w:type="default" r:id="rId30"/>
-          <w:footerReference w:type="default" r:id="rId31"/>
+          <w:headerReference w:type="even" r:id="rId28"/>
+          <w:headerReference w:type="default" r:id="rId29"/>
+          <w:footerReference w:type="default" r:id="rId30"/>
           <w:pgSz w:w="11901" w:h="16834" w:code="9"/>
           <w:pgMar w:top="1701" w:right="1418" w:bottom="1701" w:left="1701" w:header="708" w:footer="708" w:gutter="0"/>
           <w:pgNumType w:fmt="upperRoman" w:start="1"/>
@@ -11346,6 +12264,7 @@
           <w:noProof/>
           <w:lang w:eastAsia="sl-SI"/>
         </w:rPr>
+        <w:lastRenderedPageBreak/>
         <w:drawing>
           <wp:inline distT="0" distB="0" distL="0" distR="0" wp14:anchorId="5528A761" wp14:editId="13AA2336">
             <wp:extent cx="2009775" cy="1085850"/>
@@ -11600,7 +12519,7 @@
           <w:rFonts w:ascii="Calibri" w:hAnsi="Calibri"/>
         </w:rPr>
         <w:sectPr>
-          <w:headerReference w:type="default" r:id="rId32"/>
+          <w:headerReference w:type="default" r:id="rId31"/>
           <w:type w:val="continuous"/>
           <w:pgSz w:w="11901" w:h="16834" w:code="9"/>
           <w:pgMar w:top="1701" w:right="1418" w:bottom="1701" w:left="1701" w:header="708" w:footer="708" w:gutter="0"/>
@@ -11613,7 +12532,7 @@
       <w:pPr>
         <w:pStyle w:val="Subtitle"/>
         <w:sectPr>
-          <w:headerReference w:type="default" r:id="rId33"/>
+          <w:headerReference w:type="default" r:id="rId32"/>
           <w:type w:val="continuous"/>
           <w:pgSz w:w="11901" w:h="16834" w:code="9"/>
           <w:pgMar w:top="1701" w:right="1418" w:bottom="1701" w:left="1701" w:header="708" w:footer="708" w:gutter="0"/>
@@ -11654,6 +12573,7 @@
           <w:noProof/>
           <w:lang w:eastAsia="sl-SI"/>
         </w:rPr>
+        <w:lastRenderedPageBreak/>
         <w:drawing>
           <wp:inline distT="0" distB="0" distL="0" distR="0" wp14:anchorId="01158279" wp14:editId="313B03BF">
             <wp:extent cx="2009775" cy="1085850"/>
@@ -11943,7 +12863,7 @@
           <w:rFonts w:ascii="Calibri" w:hAnsi="Calibri"/>
         </w:rPr>
         <w:sectPr>
-          <w:headerReference w:type="default" r:id="rId34"/>
+          <w:headerReference w:type="default" r:id="rId33"/>
           <w:type w:val="continuous"/>
           <w:pgSz w:w="11901" w:h="16834" w:code="9"/>
           <w:pgMar w:top="1701" w:right="1418" w:bottom="1701" w:left="1701" w:header="708" w:footer="708" w:gutter="0"/>
@@ -11974,7 +12894,7 @@
           <w:rFonts w:ascii="Calibri" w:hAnsi="Calibri"/>
         </w:rPr>
         <w:sectPr>
-          <w:headerReference w:type="default" r:id="rId35"/>
+          <w:headerReference w:type="default" r:id="rId34"/>
           <w:type w:val="continuous"/>
           <w:pgSz w:w="11901" w:h="16834" w:code="9"/>
           <w:pgMar w:top="1701" w:right="1418" w:bottom="1701" w:left="1701" w:header="708" w:footer="708" w:gutter="0"/>
@@ -12115,7 +13035,21 @@
               <w:rPr>
                 <w:rFonts w:ascii="Calibri" w:hAnsi="Calibri"/>
               </w:rPr>
-              <w:t xml:space="preserve">Študent(ka): </w:t>
+              <w:t>Študent(</w:t>
+            </w:r>
+            <w:proofErr w:type="spellStart"/>
+            <w:r>
+              <w:rPr>
+                <w:rFonts w:ascii="Calibri" w:hAnsi="Calibri"/>
+              </w:rPr>
+              <w:t>ka</w:t>
+            </w:r>
+            <w:proofErr w:type="spellEnd"/>
+            <w:r>
+              <w:rPr>
+                <w:rFonts w:ascii="Calibri" w:hAnsi="Calibri"/>
+              </w:rPr>
+              <w:t xml:space="preserve">): </w:t>
             </w:r>
           </w:p>
         </w:tc>
@@ -12323,11 +13257,19 @@
                 <w:rFonts w:ascii="Calibri" w:hAnsi="Calibri"/>
               </w:rPr>
             </w:pPr>
+            <w:proofErr w:type="spellStart"/>
             <w:r>
               <w:rPr>
                 <w:rFonts w:ascii="Calibri" w:hAnsi="Calibri"/>
               </w:rPr>
-              <w:t xml:space="preserve">Somentor(ica): </w:t>
+              <w:t>Somentor</w:t>
+            </w:r>
+            <w:proofErr w:type="spellEnd"/>
+            <w:r>
+              <w:rPr>
+                <w:rFonts w:ascii="Calibri" w:hAnsi="Calibri"/>
+              </w:rPr>
+              <w:t xml:space="preserve">(ica): </w:t>
             </w:r>
           </w:p>
         </w:tc>
@@ -12430,7 +13372,7 @@
     <w:p>
       <w:pPr>
         <w:sectPr>
-          <w:headerReference w:type="default" r:id="rId36"/>
+          <w:headerReference w:type="default" r:id="rId35"/>
           <w:type w:val="continuous"/>
           <w:pgSz w:w="11901" w:h="16834" w:code="9"/>
           <w:pgMar w:top="1701" w:right="1418" w:bottom="1701" w:left="1701" w:header="708" w:footer="708" w:gutter="0"/>
@@ -12628,7 +13570,21 @@
               <w:rPr>
                 <w:rFonts w:ascii="Calibri" w:hAnsi="Calibri"/>
               </w:rPr>
-              <w:t xml:space="preserve">Študent(ka): </w:t>
+              <w:t>Študent(</w:t>
+            </w:r>
+            <w:proofErr w:type="spellStart"/>
+            <w:r>
+              <w:rPr>
+                <w:rFonts w:ascii="Calibri" w:hAnsi="Calibri"/>
+              </w:rPr>
+              <w:t>ka</w:t>
+            </w:r>
+            <w:proofErr w:type="spellEnd"/>
+            <w:r>
+              <w:rPr>
+                <w:rFonts w:ascii="Calibri" w:hAnsi="Calibri"/>
+              </w:rPr>
+              <w:t xml:space="preserve">): </w:t>
             </w:r>
           </w:p>
         </w:tc>
@@ -12834,11 +13790,19 @@
                 <w:rFonts w:ascii="Calibri" w:hAnsi="Calibri"/>
               </w:rPr>
             </w:pPr>
+            <w:proofErr w:type="spellStart"/>
             <w:r>
               <w:rPr>
                 <w:rFonts w:ascii="Calibri" w:hAnsi="Calibri"/>
               </w:rPr>
-              <w:t xml:space="preserve">Somentor(ica): </w:t>
+              <w:t>Somentor</w:t>
+            </w:r>
+            <w:proofErr w:type="spellEnd"/>
+            <w:r>
+              <w:rPr>
+                <w:rFonts w:ascii="Calibri" w:hAnsi="Calibri"/>
+              </w:rPr>
+              <w:t xml:space="preserve">(ica): </w:t>
             </w:r>
           </w:p>
         </w:tc>
@@ -12941,7 +13905,7 @@
     <w:p>
       <w:pPr>
         <w:sectPr>
-          <w:headerReference w:type="default" r:id="rId37"/>
+          <w:headerReference w:type="default" r:id="rId36"/>
           <w:pgSz w:w="11901" w:h="16834" w:code="9"/>
           <w:pgMar w:top="1701" w:right="1418" w:bottom="1701" w:left="1701" w:header="708" w:footer="708" w:gutter="0"/>
           <w:pgNumType w:fmt="upperRoman" w:start="1"/>
@@ -13128,7 +14092,21 @@
               <w:rPr>
                 <w:rFonts w:ascii="Calibri" w:hAnsi="Calibri"/>
               </w:rPr>
-              <w:t xml:space="preserve">Študent(ka): </w:t>
+              <w:t>Študent(</w:t>
+            </w:r>
+            <w:proofErr w:type="spellStart"/>
+            <w:r>
+              <w:rPr>
+                <w:rFonts w:ascii="Calibri" w:hAnsi="Calibri"/>
+              </w:rPr>
+              <w:t>ka</w:t>
+            </w:r>
+            <w:proofErr w:type="spellEnd"/>
+            <w:r>
+              <w:rPr>
+                <w:rFonts w:ascii="Calibri" w:hAnsi="Calibri"/>
+              </w:rPr>
+              <w:t xml:space="preserve">): </w:t>
             </w:r>
           </w:p>
         </w:tc>
@@ -13419,11 +14397,19 @@
                 <w:rFonts w:ascii="Calibri" w:hAnsi="Calibri"/>
               </w:rPr>
             </w:pPr>
+            <w:proofErr w:type="spellStart"/>
             <w:r>
               <w:rPr>
                 <w:rFonts w:ascii="Calibri" w:hAnsi="Calibri"/>
               </w:rPr>
-              <w:t xml:space="preserve">Somentor(ica): </w:t>
+              <w:t>Somentor</w:t>
+            </w:r>
+            <w:proofErr w:type="spellEnd"/>
+            <w:r>
+              <w:rPr>
+                <w:rFonts w:ascii="Calibri" w:hAnsi="Calibri"/>
+              </w:rPr>
+              <w:t xml:space="preserve">(ica): </w:t>
             </w:r>
           </w:p>
         </w:tc>
@@ -13529,7 +14515,30 @@
           <w:rFonts w:ascii="Calibri" w:hAnsi="Calibri"/>
         </w:rPr>
         <w:sectPr>
+          <w:headerReference w:type="default" r:id="rId37"/>
+          <w:pgSz w:w="11901" w:h="16834" w:code="9"/>
+          <w:pgMar w:top="1701" w:right="1418" w:bottom="1701" w:left="1701" w:header="708" w:footer="708" w:gutter="0"/>
+          <w:pgNumType w:fmt="upperRoman" w:start="1"/>
+          <w:cols w:space="708"/>
+        </w:sectPr>
+      </w:pPr>
+    </w:p>
+    <w:p>
+      <w:pPr>
+        <w:sectPr>
+          <w:type w:val="continuous"/>
+          <w:pgSz w:w="11901" w:h="16834" w:code="9"/>
+          <w:pgMar w:top="1701" w:right="1418" w:bottom="1701" w:left="1701" w:header="708" w:footer="708" w:gutter="0"/>
+          <w:pgNumType w:fmt="upperRoman" w:start="1"/>
+          <w:cols w:space="708"/>
+        </w:sectPr>
+      </w:pPr>
+    </w:p>
+    <w:p>
+      <w:pPr>
+        <w:sectPr>
           <w:headerReference w:type="default" r:id="rId38"/>
+          <w:type w:val="continuous"/>
           <w:pgSz w:w="11901" w:h="16834" w:code="9"/>
           <w:pgMar w:top="1701" w:right="1418" w:bottom="1701" w:left="1701" w:header="708" w:footer="708" w:gutter="0"/>
           <w:pgNumType w:fmt="upperRoman" w:start="1"/>
@@ -13573,29 +14582,6 @@
     </w:p>
     <w:p>
       <w:pPr>
-        <w:sectPr>
-          <w:headerReference w:type="default" r:id="rId40"/>
-          <w:type w:val="continuous"/>
-          <w:pgSz w:w="11901" w:h="16834" w:code="9"/>
-          <w:pgMar w:top="1701" w:right="1418" w:bottom="1701" w:left="1701" w:header="708" w:footer="708" w:gutter="0"/>
-          <w:pgNumType w:fmt="upperRoman" w:start="1"/>
-          <w:cols w:space="708"/>
-        </w:sectPr>
-      </w:pPr>
-    </w:p>
-    <w:p>
-      <w:pPr>
-        <w:sectPr>
-          <w:type w:val="continuous"/>
-          <w:pgSz w:w="11901" w:h="16834" w:code="9"/>
-          <w:pgMar w:top="1701" w:right="1418" w:bottom="1701" w:left="1701" w:header="708" w:footer="708" w:gutter="0"/>
-          <w:pgNumType w:fmt="upperRoman" w:start="1"/>
-          <w:cols w:space="708"/>
-        </w:sectPr>
-      </w:pPr>
-    </w:p>
-    <w:p>
-      <w:pPr>
         <w:spacing w:line="240" w:lineRule="auto"/>
         <w:ind w:left="720"/>
         <w:jc w:val="left"/>
@@ -14178,6 +15164,7 @@
         </w:rPr>
         <w:t xml:space="preserve">:                      </w:t>
       </w:r>
+      <w:proofErr w:type="spellStart"/>
       <w:r>
         <w:rPr>
           <w:rFonts w:ascii="Calibri" w:hAnsi="Calibri"/>
@@ -14186,6 +15173,7 @@
         </w:rPr>
         <w:t>xxxxxx</w:t>
       </w:r>
+      <w:proofErr w:type="spellEnd"/>
     </w:p>
     <w:p>
       <w:pPr>
@@ -14265,28 +15253,233 @@
           <w:i/>
           <w:lang w:val="sl-SI"/>
         </w:rPr>
-        <w:t xml:space="preserve">Pred vrstilcem UDK navedite 3 do 5 ključnih besed. </w:t>
-      </w:r>
+        <w:t xml:space="preserve">Pred </w:t>
+      </w:r>
+      <w:proofErr w:type="spellStart"/>
       <w:r>
         <w:rPr>
           <w:rFonts w:ascii="Calibri" w:hAnsi="Calibri" w:cs="Arial"/>
           <w:i/>
-        </w:rPr>
-        <w:t xml:space="preserve">Dolžina povzetka naj ne presega 100 besed. Ta stran mora biti v </w:t>
-      </w:r>
+          <w:lang w:val="sl-SI"/>
+        </w:rPr>
+        <w:t>vrstilcem</w:t>
+      </w:r>
+      <w:proofErr w:type="spellEnd"/>
       <w:r>
         <w:rPr>
           <w:rFonts w:ascii="Calibri" w:hAnsi="Calibri" w:cs="Arial"/>
           <w:i/>
-        </w:rPr>
-        <w:t>zaključnem</w:t>
-      </w:r>
+          <w:lang w:val="sl-SI"/>
+        </w:rPr>
+        <w:t xml:space="preserve"> UDK navedite 3 do 5 ključnih besed. </w:t>
+      </w:r>
+      <w:proofErr w:type="spellStart"/>
       <w:r>
         <w:rPr>
           <w:rFonts w:ascii="Calibri" w:hAnsi="Calibri" w:cs="Arial"/>
           <w:i/>
         </w:rPr>
-        <w:t xml:space="preserve"> delu seveda oštevilčena z ustrezno rimsko številko.</w:t>
+        <w:t>Dolžina</w:t>
+      </w:r>
+      <w:proofErr w:type="spellEnd"/>
+      <w:r>
+        <w:rPr>
+          <w:rFonts w:ascii="Calibri" w:hAnsi="Calibri" w:cs="Arial"/>
+          <w:i/>
+        </w:rPr>
+        <w:t xml:space="preserve"> </w:t>
+      </w:r>
+      <w:proofErr w:type="spellStart"/>
+      <w:r>
+        <w:rPr>
+          <w:rFonts w:ascii="Calibri" w:hAnsi="Calibri" w:cs="Arial"/>
+          <w:i/>
+        </w:rPr>
+        <w:t>povzetka</w:t>
+      </w:r>
+      <w:proofErr w:type="spellEnd"/>
+      <w:r>
+        <w:rPr>
+          <w:rFonts w:ascii="Calibri" w:hAnsi="Calibri" w:cs="Arial"/>
+          <w:i/>
+        </w:rPr>
+        <w:t xml:space="preserve"> </w:t>
+      </w:r>
+      <w:proofErr w:type="spellStart"/>
+      <w:r>
+        <w:rPr>
+          <w:rFonts w:ascii="Calibri" w:hAnsi="Calibri" w:cs="Arial"/>
+          <w:i/>
+        </w:rPr>
+        <w:t>naj</w:t>
+      </w:r>
+      <w:proofErr w:type="spellEnd"/>
+      <w:r>
+        <w:rPr>
+          <w:rFonts w:ascii="Calibri" w:hAnsi="Calibri" w:cs="Arial"/>
+          <w:i/>
+        </w:rPr>
+        <w:t xml:space="preserve"> ne </w:t>
+      </w:r>
+      <w:proofErr w:type="spellStart"/>
+      <w:r>
+        <w:rPr>
+          <w:rFonts w:ascii="Calibri" w:hAnsi="Calibri" w:cs="Arial"/>
+          <w:i/>
+        </w:rPr>
+        <w:t>presega</w:t>
+      </w:r>
+      <w:proofErr w:type="spellEnd"/>
+      <w:r>
+        <w:rPr>
+          <w:rFonts w:ascii="Calibri" w:hAnsi="Calibri" w:cs="Arial"/>
+          <w:i/>
+        </w:rPr>
+        <w:t xml:space="preserve"> 100 </w:t>
+      </w:r>
+      <w:proofErr w:type="spellStart"/>
+      <w:r>
+        <w:rPr>
+          <w:rFonts w:ascii="Calibri" w:hAnsi="Calibri" w:cs="Arial"/>
+          <w:i/>
+        </w:rPr>
+        <w:t>besed</w:t>
+      </w:r>
+      <w:proofErr w:type="spellEnd"/>
+      <w:r>
+        <w:rPr>
+          <w:rFonts w:ascii="Calibri" w:hAnsi="Calibri" w:cs="Arial"/>
+          <w:i/>
+        </w:rPr>
+        <w:t xml:space="preserve">. Ta </w:t>
+      </w:r>
+      <w:proofErr w:type="spellStart"/>
+      <w:r>
+        <w:rPr>
+          <w:rFonts w:ascii="Calibri" w:hAnsi="Calibri" w:cs="Arial"/>
+          <w:i/>
+        </w:rPr>
+        <w:t>stran</w:t>
+      </w:r>
+      <w:proofErr w:type="spellEnd"/>
+      <w:r>
+        <w:rPr>
+          <w:rFonts w:ascii="Calibri" w:hAnsi="Calibri" w:cs="Arial"/>
+          <w:i/>
+        </w:rPr>
+        <w:t xml:space="preserve"> mora </w:t>
+      </w:r>
+      <w:proofErr w:type="spellStart"/>
+      <w:r>
+        <w:rPr>
+          <w:rFonts w:ascii="Calibri" w:hAnsi="Calibri" w:cs="Arial"/>
+          <w:i/>
+        </w:rPr>
+        <w:t>biti</w:t>
+      </w:r>
+      <w:proofErr w:type="spellEnd"/>
+      <w:r>
+        <w:rPr>
+          <w:rFonts w:ascii="Calibri" w:hAnsi="Calibri" w:cs="Arial"/>
+          <w:i/>
+        </w:rPr>
+        <w:t xml:space="preserve"> v </w:t>
+      </w:r>
+      <w:proofErr w:type="spellStart"/>
+      <w:r>
+        <w:rPr>
+          <w:rFonts w:ascii="Calibri" w:hAnsi="Calibri" w:cs="Arial"/>
+          <w:i/>
+        </w:rPr>
+        <w:t>zaključnem</w:t>
+      </w:r>
+      <w:proofErr w:type="spellEnd"/>
+      <w:r>
+        <w:rPr>
+          <w:rFonts w:ascii="Calibri" w:hAnsi="Calibri" w:cs="Arial"/>
+          <w:i/>
+        </w:rPr>
+        <w:t xml:space="preserve"> </w:t>
+      </w:r>
+      <w:proofErr w:type="spellStart"/>
+      <w:r>
+        <w:rPr>
+          <w:rFonts w:ascii="Calibri" w:hAnsi="Calibri" w:cs="Arial"/>
+          <w:i/>
+        </w:rPr>
+        <w:t>delu</w:t>
+      </w:r>
+      <w:proofErr w:type="spellEnd"/>
+      <w:r>
+        <w:rPr>
+          <w:rFonts w:ascii="Calibri" w:hAnsi="Calibri" w:cs="Arial"/>
+          <w:i/>
+        </w:rPr>
+        <w:t xml:space="preserve"> </w:t>
+      </w:r>
+      <w:proofErr w:type="spellStart"/>
+      <w:r>
+        <w:rPr>
+          <w:rFonts w:ascii="Calibri" w:hAnsi="Calibri" w:cs="Arial"/>
+          <w:i/>
+        </w:rPr>
+        <w:t>seveda</w:t>
+      </w:r>
+      <w:proofErr w:type="spellEnd"/>
+      <w:r>
+        <w:rPr>
+          <w:rFonts w:ascii="Calibri" w:hAnsi="Calibri" w:cs="Arial"/>
+          <w:i/>
+        </w:rPr>
+        <w:t xml:space="preserve"> </w:t>
+      </w:r>
+      <w:proofErr w:type="spellStart"/>
+      <w:r>
+        <w:rPr>
+          <w:rFonts w:ascii="Calibri" w:hAnsi="Calibri" w:cs="Arial"/>
+          <w:i/>
+        </w:rPr>
+        <w:t>oštevilčena</w:t>
+      </w:r>
+      <w:proofErr w:type="spellEnd"/>
+      <w:r>
+        <w:rPr>
+          <w:rFonts w:ascii="Calibri" w:hAnsi="Calibri" w:cs="Arial"/>
+          <w:i/>
+        </w:rPr>
+        <w:t xml:space="preserve"> z </w:t>
+      </w:r>
+      <w:proofErr w:type="spellStart"/>
+      <w:r>
+        <w:rPr>
+          <w:rFonts w:ascii="Calibri" w:hAnsi="Calibri" w:cs="Arial"/>
+          <w:i/>
+        </w:rPr>
+        <w:t>ustrezno</w:t>
+      </w:r>
+      <w:proofErr w:type="spellEnd"/>
+      <w:r>
+        <w:rPr>
+          <w:rFonts w:ascii="Calibri" w:hAnsi="Calibri" w:cs="Arial"/>
+          <w:i/>
+        </w:rPr>
+        <w:t xml:space="preserve"> rimsko </w:t>
+      </w:r>
+      <w:proofErr w:type="spellStart"/>
+      <w:r>
+        <w:rPr>
+          <w:rFonts w:ascii="Calibri" w:hAnsi="Calibri" w:cs="Arial"/>
+          <w:i/>
+        </w:rPr>
+        <w:t>številko</w:t>
+      </w:r>
+      <w:proofErr w:type="spellEnd"/>
+      <w:r>
+        <w:rPr>
+          <w:rFonts w:ascii="Calibri" w:hAnsi="Calibri" w:cs="Arial"/>
+          <w:i/>
+        </w:rPr>
+        <w:t>.</w:t>
       </w:r>
     </w:p>
     <w:p>
@@ -14349,7 +15542,7 @@
           <w:lang w:val="en-US" w:eastAsia="ko-KR"/>
         </w:rPr>
         <w:sectPr>
-          <w:headerReference w:type="default" r:id="rId41"/>
+          <w:headerReference w:type="default" r:id="rId40"/>
           <w:pgSz w:w="11901" w:h="16834" w:code="9"/>
           <w:pgMar w:top="709" w:right="1418" w:bottom="1701" w:left="1701" w:header="708" w:footer="708" w:gutter="0"/>
           <w:pgNumType w:fmt="upperRoman" w:start="1"/>
@@ -14477,7 +15670,27 @@
           <w:szCs w:val="24"/>
           <w:lang w:val="de-DE"/>
         </w:rPr>
-        <w:t xml:space="preserve"> beseda1, beseda2, beseda3 (največ 5)</w:t>
+        <w:t xml:space="preserve"> beseda1, beseda2, beseda3 (</w:t>
+      </w:r>
+      <w:proofErr w:type="spellStart"/>
+      <w:r>
+        <w:rPr>
+          <w:rFonts w:ascii="Calibri" w:hAnsi="Calibri"/>
+          <w:sz w:val="24"/>
+          <w:szCs w:val="24"/>
+          <w:lang w:val="de-DE"/>
+        </w:rPr>
+        <w:t>največ</w:t>
+      </w:r>
+      <w:proofErr w:type="spellEnd"/>
+      <w:r>
+        <w:rPr>
+          <w:rFonts w:ascii="Calibri" w:hAnsi="Calibri"/>
+          <w:sz w:val="24"/>
+          <w:szCs w:val="24"/>
+          <w:lang w:val="de-DE"/>
+        </w:rPr>
+        <w:t xml:space="preserve"> 5)</w:t>
       </w:r>
       <w:r>
         <w:rPr>
@@ -14546,8 +15759,18 @@
           <w:sz w:val="24"/>
           <w:szCs w:val="24"/>
         </w:rPr>
-        <w:t xml:space="preserve">            xxxxxx</w:t>
-      </w:r>
+        <w:t xml:space="preserve">            </w:t>
+      </w:r>
+      <w:proofErr w:type="spellStart"/>
+      <w:r>
+        <w:rPr>
+          <w:rFonts w:ascii="Calibri" w:hAnsi="Calibri"/>
+          <w:sz w:val="24"/>
+          <w:szCs w:val="24"/>
+        </w:rPr>
+        <w:t>xxxxxx</w:t>
+      </w:r>
+      <w:proofErr w:type="spellEnd"/>
     </w:p>
     <w:p>
       <w:pPr>
@@ -14598,6 +15821,7 @@
         </w:rPr>
       </w:pPr>
       <w:bookmarkStart w:id="233" w:name="_Toc397326406"/>
+      <w:proofErr w:type="spellStart"/>
       <w:r>
         <w:rPr>
           <w:rFonts w:ascii="Calibri" w:hAnsi="Calibri"/>
@@ -14608,6 +15832,7 @@
         <w:t>Abstract</w:t>
       </w:r>
       <w:bookmarkEnd w:id="233"/>
+      <w:proofErr w:type="spellEnd"/>
     </w:p>
     <w:p>
       <w:pPr>
@@ -14640,22 +15865,40 @@
           <w:i/>
           <w:lang w:val="sl-SI"/>
         </w:rPr>
-        <w:t xml:space="preserve">Na tej strani naj bo čim vernejši prevod strani s slovenskim povzetkom v angleščino. Tudi ta stran mora biti v </w:t>
-      </w:r>
+        <w:t xml:space="preserve">Na tej strani naj bo čim </w:t>
+      </w:r>
+      <w:proofErr w:type="spellStart"/>
       <w:r>
         <w:rPr>
           <w:rFonts w:ascii="Calibri" w:hAnsi="Calibri" w:cs="Arial"/>
           <w:i/>
           <w:lang w:val="sl-SI"/>
         </w:rPr>
-        <w:t>zaključnem</w:t>
-      </w:r>
+        <w:t>vernejši</w:t>
+      </w:r>
+      <w:proofErr w:type="spellEnd"/>
       <w:r>
         <w:rPr>
           <w:rFonts w:ascii="Calibri" w:hAnsi="Calibri" w:cs="Arial"/>
           <w:i/>
           <w:lang w:val="sl-SI"/>
         </w:rPr>
+        <w:t xml:space="preserve"> prevod strani s slovenskim povzetkom v angleščino. Tudi ta stran mora biti v </w:t>
+      </w:r>
+      <w:r>
+        <w:rPr>
+          <w:rFonts w:ascii="Calibri" w:hAnsi="Calibri" w:cs="Arial"/>
+          <w:i/>
+          <w:lang w:val="sl-SI"/>
+        </w:rPr>
+        <w:t>zaključnem</w:t>
+      </w:r>
+      <w:r>
+        <w:rPr>
+          <w:rFonts w:ascii="Calibri" w:hAnsi="Calibri" w:cs="Arial"/>
+          <w:i/>
+          <w:lang w:val="sl-SI"/>
+        </w:rPr>
         <w:t xml:space="preserve"> delu oštevilčena z ustrezno rimsko številko</w:t>
       </w:r>
     </w:p>
@@ -14671,7 +15914,7 @@
       </w:pPr>
     </w:p>
     <w:sectPr>
-      <w:headerReference w:type="default" r:id="rId42"/>
+      <w:headerReference w:type="default" r:id="rId41"/>
       <w:pgSz w:w="11901" w:h="16834" w:code="9"/>
       <w:pgMar w:top="709" w:right="1418" w:bottom="1701" w:left="1701" w:header="708" w:footer="708" w:gutter="0"/>
       <w:pgNumType w:fmt="upperRoman" w:start="1"/>
@@ -15090,7 +16333,23 @@
         <w:footnoteRef/>
       </w:r>
       <w:r>
-        <w:t xml:space="preserve"> Navedba licence Creative Commons, glej str. … Opredelitev avtorskih pravic. Licenca se lahko prikazuje tudi s pasico.</w:t>
+        <w:t xml:space="preserve"> Navedba licence </w:t>
+      </w:r>
+      <w:proofErr w:type="spellStart"/>
+      <w:r>
+        <w:t>Creative</w:t>
+      </w:r>
+      <w:proofErr w:type="spellEnd"/>
+      <w:r>
+        <w:t xml:space="preserve"> </w:t>
+      </w:r>
+      <w:proofErr w:type="spellStart"/>
+      <w:r>
+        <w:t>Commons</w:t>
+      </w:r>
+      <w:proofErr w:type="spellEnd"/>
+      <w:r>
+        <w:t>, glej str. … Opredelitev avtorskih pravic. Licenca se lahko prikazuje tudi s pasico.</w:t>
       </w:r>
     </w:p>
   </w:footnote>
@@ -15173,9 +16432,11 @@
       <w:r>
         <w:t xml:space="preserve"> </w:t>
       </w:r>
+      <w:proofErr w:type="spellStart"/>
       <w:r>
         <w:t>Mehatronika</w:t>
       </w:r>
+      <w:proofErr w:type="spellEnd"/>
     </w:p>
   </w:footnote>
   <w:footnote w:id="15">
@@ -15216,7 +16477,23 @@
         <w:footnoteRef/>
       </w:r>
       <w:r>
-        <w:t xml:space="preserve"> Navedba licence Creative Commons, glej str. … Opredelitev avtorskih pravic. Licenca se lahko prikazuje tudi s pasico.</w:t>
+        <w:t xml:space="preserve"> Navedba licence </w:t>
+      </w:r>
+      <w:proofErr w:type="spellStart"/>
+      <w:r>
+        <w:t>Creative</w:t>
+      </w:r>
+      <w:proofErr w:type="spellEnd"/>
+      <w:r>
+        <w:t xml:space="preserve"> </w:t>
+      </w:r>
+      <w:proofErr w:type="spellStart"/>
+      <w:r>
+        <w:t>Commons</w:t>
+      </w:r>
+      <w:proofErr w:type="spellEnd"/>
+      <w:r>
+        <w:t>, glej str. … Opredelitev avtorskih pravic. Licenca se lahko prikazuje tudi s pasico.</w:t>
       </w:r>
     </w:p>
   </w:footnote>
@@ -15335,7 +16612,23 @@
         <w:footnoteRef/>
       </w:r>
       <w:r>
-        <w:t xml:space="preserve"> Navedba licence Creative Commons, glej str. … Opredelitev avtorskih pravic. Licenca se lahko prikazuje tudi s pasico.</w:t>
+        <w:t xml:space="preserve"> Navedba licence </w:t>
+      </w:r>
+      <w:proofErr w:type="spellStart"/>
+      <w:r>
+        <w:t>Creative</w:t>
+      </w:r>
+      <w:proofErr w:type="spellEnd"/>
+      <w:r>
+        <w:t xml:space="preserve"> </w:t>
+      </w:r>
+      <w:proofErr w:type="spellStart"/>
+      <w:r>
+        <w:t>Commons</w:t>
+      </w:r>
+      <w:proofErr w:type="spellEnd"/>
+      <w:r>
+        <w:t>, glej str. … Opredelitev avtorskih pravic. Licenca se lahko prikazuje tudi s pasico.</w:t>
       </w:r>
     </w:p>
   </w:footnote>
@@ -15364,8 +16657,29 @@
     <w:pPr>
       <w:pStyle w:val="Header"/>
     </w:pPr>
+    <w:proofErr w:type="spellStart"/>
     <w:r>
-      <w:t xml:space="preserve">Navodila za izdelavo diplomskih </w:t>
+      <w:t>Navodila</w:t>
+    </w:r>
+    <w:proofErr w:type="spellEnd"/>
+    <w:r>
+      <w:t xml:space="preserve"> za </w:t>
+    </w:r>
+    <w:proofErr w:type="spellStart"/>
+    <w:r>
+      <w:t>izdelavo</w:t>
+    </w:r>
+    <w:proofErr w:type="spellEnd"/>
+    <w:r>
+      <w:t xml:space="preserve"> </w:t>
+    </w:r>
+    <w:proofErr w:type="spellStart"/>
+    <w:r>
+      <w:t>diplomskih</w:t>
+    </w:r>
+    <w:proofErr w:type="spellEnd"/>
+    <w:r>
+      <w:t xml:space="preserve"> </w:t>
     </w:r>
     <w:smartTag w:uri="urn:schemas-microsoft-com:office:smarttags" w:element="State">
       <w:smartTag w:uri="urn:schemas-microsoft-com:office:smarttags" w:element="place">
@@ -15375,7 +16689,39 @@
       </w:smartTag>
     </w:smartTag>
     <w:r>
-      <w:t xml:space="preserve"> na dodiplomskih študijskih programih UM FERI</w:t>
+      <w:t xml:space="preserve"> </w:t>
+    </w:r>
+    <w:proofErr w:type="spellStart"/>
+    <w:r>
+      <w:t>na</w:t>
+    </w:r>
+    <w:proofErr w:type="spellEnd"/>
+    <w:r>
+      <w:t xml:space="preserve"> </w:t>
+    </w:r>
+    <w:proofErr w:type="spellStart"/>
+    <w:r>
+      <w:t>dodiplomskih</w:t>
+    </w:r>
+    <w:proofErr w:type="spellEnd"/>
+    <w:r>
+      <w:t xml:space="preserve"> </w:t>
+    </w:r>
+    <w:proofErr w:type="spellStart"/>
+    <w:r>
+      <w:t>študijskih</w:t>
+    </w:r>
+    <w:proofErr w:type="spellEnd"/>
+    <w:r>
+      <w:t xml:space="preserve"> </w:t>
+    </w:r>
+    <w:proofErr w:type="spellStart"/>
+    <w:r>
+      <w:t>programih</w:t>
+    </w:r>
+    <w:proofErr w:type="spellEnd"/>
+    <w:r>
+      <w:t xml:space="preserve"> UM FERI</w:t>
     </w:r>
     <w:r>
       <w:rPr>
@@ -15484,6 +16830,9 @@
   <w:p>
     <w:pPr>
       <w:pStyle w:val="Header"/>
+      <w:rPr>
+        <w:lang w:val="de-DE"/>
+      </w:rPr>
     </w:pPr>
   </w:p>
 </w:hdr>
@@ -15644,38 +16993,160 @@
         <w:lang w:val="de-AT"/>
       </w:rPr>
     </w:pPr>
+    <w:proofErr w:type="spellStart"/>
     <w:r>
       <w:rPr>
         <w:rFonts w:ascii="Calibri" w:hAnsi="Calibri"/>
         <w:color w:val="auto"/>
         <w:lang w:val="de-AT"/>
       </w:rPr>
-      <w:t xml:space="preserve">Navodila za pisanje </w:t>
+      <w:t>Navodila</w:t>
     </w:r>
+    <w:proofErr w:type="spellEnd"/>
     <w:r>
       <w:rPr>
         <w:rFonts w:ascii="Calibri" w:hAnsi="Calibri"/>
         <w:color w:val="auto"/>
         <w:lang w:val="de-AT"/>
       </w:rPr>
-      <w:t>zaključnih</w:t>
+      <w:t xml:space="preserve"> </w:t>
     </w:r>
+    <w:proofErr w:type="spellStart"/>
     <w:r>
       <w:rPr>
         <w:rFonts w:ascii="Calibri" w:hAnsi="Calibri"/>
         <w:color w:val="auto"/>
         <w:lang w:val="de-AT"/>
       </w:rPr>
-      <w:t xml:space="preserve"> del na študijskih programih</w:t>
+      <w:t>za</w:t>
     </w:r>
+    <w:proofErr w:type="spellEnd"/>
     <w:r>
       <w:rPr>
         <w:rFonts w:ascii="Calibri" w:hAnsi="Calibri"/>
         <w:color w:val="auto"/>
         <w:lang w:val="de-AT"/>
       </w:rPr>
-      <w:t xml:space="preserve"> prve in druge stopnje</w:t>
+      <w:t xml:space="preserve"> </w:t>
     </w:r>
+    <w:proofErr w:type="spellStart"/>
+    <w:r>
+      <w:rPr>
+        <w:rFonts w:ascii="Calibri" w:hAnsi="Calibri"/>
+        <w:color w:val="auto"/>
+        <w:lang w:val="de-AT"/>
+      </w:rPr>
+      <w:t>pisanje</w:t>
+    </w:r>
+    <w:proofErr w:type="spellEnd"/>
+    <w:r>
+      <w:rPr>
+        <w:rFonts w:ascii="Calibri" w:hAnsi="Calibri"/>
+        <w:color w:val="auto"/>
+        <w:lang w:val="de-AT"/>
+      </w:rPr>
+      <w:t xml:space="preserve"> </w:t>
+    </w:r>
+    <w:proofErr w:type="spellStart"/>
+    <w:r>
+      <w:rPr>
+        <w:rFonts w:ascii="Calibri" w:hAnsi="Calibri"/>
+        <w:color w:val="auto"/>
+        <w:lang w:val="de-AT"/>
+      </w:rPr>
+      <w:t>zaključnih</w:t>
+    </w:r>
+    <w:proofErr w:type="spellEnd"/>
+    <w:r>
+      <w:rPr>
+        <w:rFonts w:ascii="Calibri" w:hAnsi="Calibri"/>
+        <w:color w:val="auto"/>
+        <w:lang w:val="de-AT"/>
+      </w:rPr>
+      <w:t xml:space="preserve"> del na </w:t>
+    </w:r>
+    <w:proofErr w:type="spellStart"/>
+    <w:r>
+      <w:rPr>
+        <w:rFonts w:ascii="Calibri" w:hAnsi="Calibri"/>
+        <w:color w:val="auto"/>
+        <w:lang w:val="de-AT"/>
+      </w:rPr>
+      <w:t>študijskih</w:t>
+    </w:r>
+    <w:proofErr w:type="spellEnd"/>
+    <w:r>
+      <w:rPr>
+        <w:rFonts w:ascii="Calibri" w:hAnsi="Calibri"/>
+        <w:color w:val="auto"/>
+        <w:lang w:val="de-AT"/>
+      </w:rPr>
+      <w:t xml:space="preserve"> </w:t>
+    </w:r>
+    <w:proofErr w:type="spellStart"/>
+    <w:r>
+      <w:rPr>
+        <w:rFonts w:ascii="Calibri" w:hAnsi="Calibri"/>
+        <w:color w:val="auto"/>
+        <w:lang w:val="de-AT"/>
+      </w:rPr>
+      <w:t>programih</w:t>
+    </w:r>
+    <w:proofErr w:type="spellEnd"/>
+    <w:r>
+      <w:rPr>
+        <w:rFonts w:ascii="Calibri" w:hAnsi="Calibri"/>
+        <w:color w:val="auto"/>
+        <w:lang w:val="de-AT"/>
+      </w:rPr>
+      <w:t xml:space="preserve"> </w:t>
+    </w:r>
+    <w:proofErr w:type="spellStart"/>
+    <w:r>
+      <w:rPr>
+        <w:rFonts w:ascii="Calibri" w:hAnsi="Calibri"/>
+        <w:color w:val="auto"/>
+        <w:lang w:val="de-AT"/>
+      </w:rPr>
+      <w:t>prve</w:t>
+    </w:r>
+    <w:proofErr w:type="spellEnd"/>
+    <w:r>
+      <w:rPr>
+        <w:rFonts w:ascii="Calibri" w:hAnsi="Calibri"/>
+        <w:color w:val="auto"/>
+        <w:lang w:val="de-AT"/>
+      </w:rPr>
+      <w:t xml:space="preserve"> in </w:t>
+    </w:r>
+    <w:proofErr w:type="spellStart"/>
+    <w:r>
+      <w:rPr>
+        <w:rFonts w:ascii="Calibri" w:hAnsi="Calibri"/>
+        <w:color w:val="auto"/>
+        <w:lang w:val="de-AT"/>
+      </w:rPr>
+      <w:t>druge</w:t>
+    </w:r>
+    <w:proofErr w:type="spellEnd"/>
+    <w:r>
+      <w:rPr>
+        <w:rFonts w:ascii="Calibri" w:hAnsi="Calibri"/>
+        <w:color w:val="auto"/>
+        <w:lang w:val="de-AT"/>
+      </w:rPr>
+      <w:t xml:space="preserve"> </w:t>
+    </w:r>
+    <w:proofErr w:type="spellStart"/>
+    <w:r>
+      <w:rPr>
+        <w:rFonts w:ascii="Calibri" w:hAnsi="Calibri"/>
+        <w:color w:val="auto"/>
+        <w:lang w:val="de-AT"/>
+      </w:rPr>
+      <w:t>stopnje</w:t>
+    </w:r>
+    <w:proofErr w:type="spellEnd"/>
     <w:r>
       <w:rPr>
         <w:rFonts w:ascii="Calibri" w:hAnsi="Calibri"/>
@@ -15800,38 +17271,160 @@
         <w:lang w:val="de-AT"/>
       </w:rPr>
     </w:pPr>
+    <w:proofErr w:type="spellStart"/>
     <w:r>
       <w:rPr>
         <w:rFonts w:ascii="Calibri" w:hAnsi="Calibri"/>
         <w:color w:val="auto"/>
         <w:lang w:val="de-AT"/>
       </w:rPr>
-      <w:t xml:space="preserve">Navodila za pisanje </w:t>
+      <w:t>Navodila</w:t>
     </w:r>
+    <w:proofErr w:type="spellEnd"/>
     <w:r>
       <w:rPr>
         <w:rFonts w:ascii="Calibri" w:hAnsi="Calibri"/>
         <w:color w:val="auto"/>
         <w:lang w:val="de-AT"/>
       </w:rPr>
-      <w:t>zaključnih</w:t>
+      <w:t xml:space="preserve"> </w:t>
     </w:r>
+    <w:proofErr w:type="spellStart"/>
     <w:r>
       <w:rPr>
         <w:rFonts w:ascii="Calibri" w:hAnsi="Calibri"/>
         <w:color w:val="auto"/>
         <w:lang w:val="de-AT"/>
       </w:rPr>
-      <w:t xml:space="preserve"> del na študijskih programih</w:t>
+      <w:t>za</w:t>
     </w:r>
+    <w:proofErr w:type="spellEnd"/>
     <w:r>
       <w:rPr>
         <w:rFonts w:ascii="Calibri" w:hAnsi="Calibri"/>
         <w:color w:val="auto"/>
         <w:lang w:val="de-AT"/>
       </w:rPr>
-      <w:t xml:space="preserve"> prve in druge stopnje</w:t>
+      <w:t xml:space="preserve"> </w:t>
     </w:r>
+    <w:proofErr w:type="spellStart"/>
+    <w:r>
+      <w:rPr>
+        <w:rFonts w:ascii="Calibri" w:hAnsi="Calibri"/>
+        <w:color w:val="auto"/>
+        <w:lang w:val="de-AT"/>
+      </w:rPr>
+      <w:t>pisanje</w:t>
+    </w:r>
+    <w:proofErr w:type="spellEnd"/>
+    <w:r>
+      <w:rPr>
+        <w:rFonts w:ascii="Calibri" w:hAnsi="Calibri"/>
+        <w:color w:val="auto"/>
+        <w:lang w:val="de-AT"/>
+      </w:rPr>
+      <w:t xml:space="preserve"> </w:t>
+    </w:r>
+    <w:proofErr w:type="spellStart"/>
+    <w:r>
+      <w:rPr>
+        <w:rFonts w:ascii="Calibri" w:hAnsi="Calibri"/>
+        <w:color w:val="auto"/>
+        <w:lang w:val="de-AT"/>
+      </w:rPr>
+      <w:t>zaključnih</w:t>
+    </w:r>
+    <w:proofErr w:type="spellEnd"/>
+    <w:r>
+      <w:rPr>
+        <w:rFonts w:ascii="Calibri" w:hAnsi="Calibri"/>
+        <w:color w:val="auto"/>
+        <w:lang w:val="de-AT"/>
+      </w:rPr>
+      <w:t xml:space="preserve"> del na </w:t>
+    </w:r>
+    <w:proofErr w:type="spellStart"/>
+    <w:r>
+      <w:rPr>
+        <w:rFonts w:ascii="Calibri" w:hAnsi="Calibri"/>
+        <w:color w:val="auto"/>
+        <w:lang w:val="de-AT"/>
+      </w:rPr>
+      <w:t>študijskih</w:t>
+    </w:r>
+    <w:proofErr w:type="spellEnd"/>
+    <w:r>
+      <w:rPr>
+        <w:rFonts w:ascii="Calibri" w:hAnsi="Calibri"/>
+        <w:color w:val="auto"/>
+        <w:lang w:val="de-AT"/>
+      </w:rPr>
+      <w:t xml:space="preserve"> </w:t>
+    </w:r>
+    <w:proofErr w:type="spellStart"/>
+    <w:r>
+      <w:rPr>
+        <w:rFonts w:ascii="Calibri" w:hAnsi="Calibri"/>
+        <w:color w:val="auto"/>
+        <w:lang w:val="de-AT"/>
+      </w:rPr>
+      <w:t>programih</w:t>
+    </w:r>
+    <w:proofErr w:type="spellEnd"/>
+    <w:r>
+      <w:rPr>
+        <w:rFonts w:ascii="Calibri" w:hAnsi="Calibri"/>
+        <w:color w:val="auto"/>
+        <w:lang w:val="de-AT"/>
+      </w:rPr>
+      <w:t xml:space="preserve"> </w:t>
+    </w:r>
+    <w:proofErr w:type="spellStart"/>
+    <w:r>
+      <w:rPr>
+        <w:rFonts w:ascii="Calibri" w:hAnsi="Calibri"/>
+        <w:color w:val="auto"/>
+        <w:lang w:val="de-AT"/>
+      </w:rPr>
+      <w:t>prve</w:t>
+    </w:r>
+    <w:proofErr w:type="spellEnd"/>
+    <w:r>
+      <w:rPr>
+        <w:rFonts w:ascii="Calibri" w:hAnsi="Calibri"/>
+        <w:color w:val="auto"/>
+        <w:lang w:val="de-AT"/>
+      </w:rPr>
+      <w:t xml:space="preserve"> in </w:t>
+    </w:r>
+    <w:proofErr w:type="spellStart"/>
+    <w:r>
+      <w:rPr>
+        <w:rFonts w:ascii="Calibri" w:hAnsi="Calibri"/>
+        <w:color w:val="auto"/>
+        <w:lang w:val="de-AT"/>
+      </w:rPr>
+      <w:t>druge</w:t>
+    </w:r>
+    <w:proofErr w:type="spellEnd"/>
+    <w:r>
+      <w:rPr>
+        <w:rFonts w:ascii="Calibri" w:hAnsi="Calibri"/>
+        <w:color w:val="auto"/>
+        <w:lang w:val="de-AT"/>
+      </w:rPr>
+      <w:t xml:space="preserve"> </w:t>
+    </w:r>
+    <w:proofErr w:type="spellStart"/>
+    <w:r>
+      <w:rPr>
+        <w:rFonts w:ascii="Calibri" w:hAnsi="Calibri"/>
+        <w:color w:val="auto"/>
+        <w:lang w:val="de-AT"/>
+      </w:rPr>
+      <w:t>stopnje</w:t>
+    </w:r>
+    <w:proofErr w:type="spellEnd"/>
     <w:r>
       <w:rPr>
         <w:rFonts w:ascii="Calibri" w:hAnsi="Calibri"/>

</xml_diff>